<commit_message>
Updated Main and pub bias rest
</commit_message>
<xml_diff>
--- a/PNASTemplateforMainManuscript Group-based.docx
+++ b/PNASTemplateforMainManuscript Group-based.docx
@@ -12135,25 +12135,7 @@
           <w:sz w:val="20"/>
           <w:szCs w:val="20"/>
         </w:rPr>
-        <w:t xml:space="preserve">The authors would like to thank Jens </w:t>
-      </w:r>
-      <w:proofErr w:type="spellStart"/>
-      <w:r>
-        <w:rPr>
-          <w:rFonts w:ascii="Arial" w:hAnsi="Arial" w:cs="Arial"/>
-          <w:sz w:val="20"/>
-          <w:szCs w:val="20"/>
-        </w:rPr>
-        <w:t>Dietrichson</w:t>
-      </w:r>
-      <w:proofErr w:type="spellEnd"/>
-      <w:r>
-        <w:rPr>
-          <w:rFonts w:ascii="Arial" w:hAnsi="Arial" w:cs="Arial"/>
-          <w:sz w:val="20"/>
-          <w:szCs w:val="20"/>
-        </w:rPr>
-        <w:t xml:space="preserve"> and James Pustejovsky</w:t>
+        <w:t>The authors would like to thank Jens Dietrichson and James Pustejovsky</w:t>
       </w:r>
       <w:r>
         <w:rPr>
@@ -12238,24 +12220,6 @@
     </w:p>
     <w:p>
       <w:pPr>
-        <w:pBdr>
-          <w:top w:val="nil"/>
-          <w:left w:val="nil"/>
-          <w:bottom w:val="nil"/>
-          <w:right w:val="nil"/>
-          <w:between w:val="nil"/>
-        </w:pBdr>
-        <w:contextualSpacing/>
-        <w:rPr>
-          <w:rFonts w:ascii="Arial" w:hAnsi="Arial" w:cs="Arial"/>
-          <w:color w:val="000000"/>
-          <w:sz w:val="20"/>
-          <w:szCs w:val="20"/>
-        </w:rPr>
-      </w:pPr>
-    </w:p>
-    <w:p>
-      <w:pPr>
         <w:pStyle w:val="Bibliography"/>
         <w:tabs>
           <w:tab w:val="clear" w:pos="384"/>
@@ -12296,38 +12260,14 @@
       </w:r>
       <w:r>
         <w:tab/>
-      </w:r>
-      <w:proofErr w:type="spellStart"/>
-      <w:r>
-        <w:t>Draine</w:t>
-      </w:r>
-      <w:proofErr w:type="spellEnd"/>
-      <w:r>
-        <w:t xml:space="preserve">, J., </w:t>
-      </w:r>
-      <w:proofErr w:type="spellStart"/>
-      <w:r>
-        <w:t>Salzer</w:t>
-      </w:r>
-      <w:proofErr w:type="spellEnd"/>
-      <w:r>
-        <w:t xml:space="preserve">, M. S., Culhane, D. P. &amp; Hadley, T. R. Role of social disadvantage in crime, joblessness, and homelessness among persons with serious mental illness. </w:t>
-      </w:r>
-      <w:proofErr w:type="spellStart"/>
+        <w:t xml:space="preserve">Draine, J., Salzer, M. S., Culhane, D. P. &amp; Hadley, T. R. Role of social disadvantage in crime, joblessness, and homelessness among persons with serious mental illness. </w:t>
+      </w:r>
       <w:r>
         <w:rPr>
           <w:i/>
           <w:iCs/>
         </w:rPr>
-        <w:t>Psychiatr</w:t>
-      </w:r>
-      <w:proofErr w:type="spellEnd"/>
-      <w:r>
-        <w:rPr>
-          <w:i/>
-          <w:iCs/>
-        </w:rPr>
-        <w:t>. Serv.</w:t>
+        <w:t>Psychiatr. Serv.</w:t>
       </w:r>
       <w:r>
         <w:t xml:space="preserve"> </w:t>
@@ -12358,15 +12298,7 @@
       </w:r>
       <w:r>
         <w:tab/>
-        <w:t xml:space="preserve">Lai, H. M. X., Cleary, M., </w:t>
-      </w:r>
-      <w:proofErr w:type="spellStart"/>
-      <w:r>
-        <w:t>Sitharthan</w:t>
-      </w:r>
-      <w:proofErr w:type="spellEnd"/>
-      <w:r>
-        <w:t xml:space="preserve">, T. &amp; Hunt, G. E. Prevalence of comorbid substance use, anxiety and mood disorders in epidemiological surveys, 1990–2014: A systematic review and meta-analysis. </w:t>
+        <w:t xml:space="preserve">Lai, H. M. X., Cleary, M., Sitharthan, T. &amp; Hunt, G. E. Prevalence of comorbid substance use, anxiety and mood disorders in epidemiological surveys, 1990–2014: A systematic review and meta-analysis. </w:t>
       </w:r>
       <w:r>
         <w:rPr>
@@ -12404,31 +12336,7 @@
       </w:r>
       <w:r>
         <w:tab/>
-        <w:t xml:space="preserve">Nielsen, S. F., </w:t>
-      </w:r>
-      <w:proofErr w:type="spellStart"/>
-      <w:r>
-        <w:t>Hjorthøj</w:t>
-      </w:r>
-      <w:proofErr w:type="spellEnd"/>
-      <w:r>
-        <w:t xml:space="preserve">, C. R., </w:t>
-      </w:r>
-      <w:proofErr w:type="spellStart"/>
-      <w:r>
-        <w:t>Erlangsen</w:t>
-      </w:r>
-      <w:proofErr w:type="spellEnd"/>
-      <w:r>
-        <w:t xml:space="preserve">, A. &amp; </w:t>
-      </w:r>
-      <w:proofErr w:type="spellStart"/>
-      <w:r>
-        <w:t>Nordentoft</w:t>
-      </w:r>
-      <w:proofErr w:type="spellEnd"/>
-      <w:r>
-        <w:t xml:space="preserve">, M. Psychiatric disorders and mortality among people in homeless shelters in Denmark: a nationwide register-based cohort study. </w:t>
+        <w:t xml:space="preserve">Nielsen, S. F., Hjorthøj, C. R., Erlangsen, A. &amp; Nordentoft, M. Psychiatric disorders and mortality among people in homeless shelters in Denmark: a nationwide register-based cohort study. </w:t>
       </w:r>
       <w:r>
         <w:rPr>
@@ -12466,14 +12374,7 @@
       </w:r>
       <w:r>
         <w:tab/>
-      </w:r>
-      <w:proofErr w:type="spellStart"/>
-      <w:r>
-        <w:t>Schreiter</w:t>
-      </w:r>
-      <w:proofErr w:type="spellEnd"/>
-      <w:r>
-        <w:t xml:space="preserve">, S. </w:t>
+        <w:t xml:space="preserve">Schreiter, S. </w:t>
       </w:r>
       <w:r>
         <w:rPr>
@@ -12485,37 +12386,12 @@
       <w:r>
         <w:t xml:space="preserve"> The prevalence of mental illness in homeless people in Germany: A systematic review and meta-analysis. </w:t>
       </w:r>
-      <w:proofErr w:type="spellStart"/>
       <w:r>
         <w:rPr>
           <w:i/>
           <w:iCs/>
         </w:rPr>
-        <w:t>Dtsch</w:t>
-      </w:r>
-      <w:proofErr w:type="spellEnd"/>
-      <w:r>
-        <w:rPr>
-          <w:i/>
-          <w:iCs/>
-        </w:rPr>
-        <w:t xml:space="preserve">. </w:t>
-      </w:r>
-      <w:proofErr w:type="spellStart"/>
-      <w:r>
-        <w:rPr>
-          <w:i/>
-          <w:iCs/>
-        </w:rPr>
-        <w:t>Aerzteblatt</w:t>
-      </w:r>
-      <w:proofErr w:type="spellEnd"/>
-      <w:r>
-        <w:rPr>
-          <w:i/>
-          <w:iCs/>
-        </w:rPr>
-        <w:t xml:space="preserve"> Int.</w:t>
+        <w:t>Dtsch. Aerzteblatt Int.</w:t>
       </w:r>
       <w:r>
         <w:t xml:space="preserve"> </w:t>
@@ -12680,15 +12556,7 @@
         <w:t>et al.</w:t>
       </w:r>
       <w:r>
-        <w:t xml:space="preserve"> A meta-analytic review of psychosocial interventions for substance </w:t>
-      </w:r>
-      <w:proofErr w:type="gramStart"/>
-      <w:r>
-        <w:t>use</w:t>
-      </w:r>
-      <w:proofErr w:type="gramEnd"/>
-      <w:r>
-        <w:t xml:space="preserve"> disorders. </w:t>
+        <w:t xml:space="preserve"> A meta-analytic review of psychosocial interventions for substance use disorders. </w:t>
       </w:r>
       <w:r>
         <w:rPr>
@@ -12738,21 +12606,12 @@
       <w:r>
         <w:t xml:space="preserve"> Effectiveness of peer support in reducing readmissions of persons with multiple psychiatric hospitalizations. </w:t>
       </w:r>
-      <w:proofErr w:type="spellStart"/>
       <w:r>
         <w:rPr>
           <w:i/>
           <w:iCs/>
         </w:rPr>
-        <w:t>Psychiatr</w:t>
-      </w:r>
-      <w:proofErr w:type="spellEnd"/>
-      <w:r>
-        <w:rPr>
-          <w:i/>
-          <w:iCs/>
-        </w:rPr>
-        <w:t>. Serv.</w:t>
+        <w:t>Psychiatr. Serv.</w:t>
       </w:r>
       <w:r>
         <w:t xml:space="preserve"> </w:t>
@@ -12783,30 +12642,14 @@
       </w:r>
       <w:r>
         <w:tab/>
-      </w:r>
-      <w:proofErr w:type="spellStart"/>
-      <w:r>
-        <w:t>Ziguras</w:t>
-      </w:r>
-      <w:proofErr w:type="spellEnd"/>
-      <w:r>
-        <w:t xml:space="preserve">, S. J. &amp; Stuart, G. W. A meta-analysis of the effectiveness of mental health case management over 20 years. </w:t>
-      </w:r>
-      <w:proofErr w:type="spellStart"/>
+        <w:t xml:space="preserve">Ziguras, S. J. &amp; Stuart, G. W. A meta-analysis of the effectiveness of mental health case management over 20 years. </w:t>
+      </w:r>
       <w:r>
         <w:rPr>
           <w:i/>
           <w:iCs/>
         </w:rPr>
-        <w:t>Psychiatr</w:t>
-      </w:r>
-      <w:proofErr w:type="spellEnd"/>
-      <w:r>
-        <w:rPr>
-          <w:i/>
-          <w:iCs/>
-        </w:rPr>
-        <w:t>. Serv.</w:t>
+        <w:t>Psychiatr. Serv.</w:t>
       </w:r>
       <w:r>
         <w:t xml:space="preserve"> </w:t>
@@ -12837,38 +12680,7 @@
       </w:r>
       <w:r>
         <w:tab/>
-      </w:r>
-      <w:proofErr w:type="spellStart"/>
-      <w:r>
-        <w:t>Wahlbeck</w:t>
-      </w:r>
-      <w:proofErr w:type="spellEnd"/>
-      <w:r>
-        <w:t xml:space="preserve">, K., Westman, J., </w:t>
-      </w:r>
-      <w:proofErr w:type="spellStart"/>
-      <w:r>
-        <w:t>Nordentoft</w:t>
-      </w:r>
-      <w:proofErr w:type="spellEnd"/>
-      <w:r>
-        <w:t xml:space="preserve">, M., </w:t>
-      </w:r>
-      <w:proofErr w:type="spellStart"/>
-      <w:r>
-        <w:t>Gissler</w:t>
-      </w:r>
-      <w:proofErr w:type="spellEnd"/>
-      <w:r>
-        <w:t xml:space="preserve">, M. &amp; </w:t>
-      </w:r>
-      <w:proofErr w:type="spellStart"/>
-      <w:r>
-        <w:t>Laursen</w:t>
-      </w:r>
-      <w:proofErr w:type="spellEnd"/>
-      <w:r>
-        <w:t xml:space="preserve">, T. M. Outcomes of Nordic mental health systems: life expectancy of patients with mental disorders. </w:t>
+        <w:t xml:space="preserve">Wahlbeck, K., Westman, J., Nordentoft, M., Gissler, M. &amp; Laursen, T. M. Outcomes of Nordic mental health systems: life expectancy of patients with mental disorders. </w:t>
       </w:r>
       <w:r>
         <w:rPr>
@@ -12906,30 +12718,7 @@
       </w:r>
       <w:r>
         <w:tab/>
-      </w:r>
-      <w:proofErr w:type="spellStart"/>
-      <w:r>
-        <w:t>Ruesch</w:t>
-      </w:r>
-      <w:proofErr w:type="spellEnd"/>
-      <w:r>
-        <w:t xml:space="preserve">, M., </w:t>
-      </w:r>
-      <w:proofErr w:type="spellStart"/>
-      <w:r>
-        <w:t>Helmes</w:t>
-      </w:r>
-      <w:proofErr w:type="spellEnd"/>
-      <w:r>
-        <w:t xml:space="preserve">, A. W., </w:t>
-      </w:r>
-      <w:proofErr w:type="spellStart"/>
-      <w:r>
-        <w:t>Bengel</w:t>
-      </w:r>
-      <w:proofErr w:type="spellEnd"/>
-      <w:r>
-        <w:t xml:space="preserve">, &amp; J. Immediate help through group therapy for patients with somatic diseases and depressive or adjustment disorders in outpatient care: study protocol for a randomized controlled trial. </w:t>
+        <w:t xml:space="preserve">Ruesch, M., Helmes, A. W., Bengel, &amp; J. Immediate help through group therapy for patients with somatic diseases and depressive or adjustment disorders in outpatient care: study protocol for a randomized controlled trial. </w:t>
       </w:r>
       <w:r>
         <w:rPr>
@@ -12974,23 +12763,7 @@
           <w:i/>
           <w:iCs/>
         </w:rPr>
-        <w:t xml:space="preserve">Natl. Inst. Health Care </w:t>
-      </w:r>
-      <w:proofErr w:type="spellStart"/>
-      <w:r>
-        <w:rPr>
-          <w:i/>
-          <w:iCs/>
-        </w:rPr>
-        <w:t>Excell</w:t>
-      </w:r>
-      <w:proofErr w:type="spellEnd"/>
-      <w:r>
-        <w:rPr>
-          <w:i/>
-          <w:iCs/>
-        </w:rPr>
-        <w:t>.</w:t>
+        <w:t>Natl. Inst. Health Care Excell.</w:t>
       </w:r>
       <w:r>
         <w:t xml:space="preserve"> </w:t>
@@ -13028,23 +12801,7 @@
           <w:i/>
           <w:iCs/>
         </w:rPr>
-        <w:t xml:space="preserve">Introduction to Group Therapy </w:t>
-      </w:r>
-      <w:proofErr w:type="gramStart"/>
-      <w:r>
-        <w:rPr>
-          <w:i/>
-          <w:iCs/>
-        </w:rPr>
-        <w:t>( 3</w:t>
-      </w:r>
-      <w:proofErr w:type="gramEnd"/>
-      <w:r>
-        <w:rPr>
-          <w:i/>
-          <w:iCs/>
-        </w:rPr>
-        <w:t>rd Ed.)</w:t>
+        <w:t>Introduction to Group Therapy ( 3rd Ed.)</w:t>
       </w:r>
       <w:r>
         <w:t>. (2019).</w:t>
@@ -13066,15 +12823,7 @@
       </w:r>
       <w:r>
         <w:tab/>
-        <w:t xml:space="preserve">Brown, R. A. &amp; </w:t>
-      </w:r>
-      <w:proofErr w:type="spellStart"/>
-      <w:r>
-        <w:t>Lewinsohn</w:t>
-      </w:r>
-      <w:proofErr w:type="spellEnd"/>
-      <w:r>
-        <w:t xml:space="preserve">, P. M. A psychoeducational approach to the treatment of depression: Comparison of group, individual, and minimal contact procedures. </w:t>
+        <w:t xml:space="preserve">Brown, R. A. &amp; Lewinsohn, P. M. A psychoeducational approach to the treatment of depression: Comparison of group, individual, and minimal contact procedures. </w:t>
       </w:r>
       <w:r>
         <w:rPr>
@@ -13112,14 +12861,7 @@
       </w:r>
       <w:r>
         <w:tab/>
-      </w:r>
-      <w:proofErr w:type="spellStart"/>
-      <w:r>
-        <w:t>Hammen</w:t>
-      </w:r>
-      <w:proofErr w:type="spellEnd"/>
-      <w:r>
-        <w:t xml:space="preserve">, C. Depression Runs in Families: The social context of risk and resilience in children of depressed mothers. </w:t>
+        <w:t xml:space="preserve">Hammen, C. Depression Runs in Families: The social context of risk and resilience in children of depressed mothers. </w:t>
       </w:r>
       <w:r>
         <w:rPr>
@@ -13147,14 +12889,7 @@
       </w:r>
       <w:r>
         <w:tab/>
-      </w:r>
-      <w:proofErr w:type="spellStart"/>
-      <w:r>
-        <w:t>Keitner</w:t>
-      </w:r>
-      <w:proofErr w:type="spellEnd"/>
-      <w:r>
-        <w:t xml:space="preserve">, G. I. &amp; Miller, I. W. Family functioning and major depression: An overview. </w:t>
+        <w:t xml:space="preserve">Keitner, G. I. &amp; Miller, I. W. Family functioning and major depression: An overview. </w:t>
       </w:r>
       <w:r>
         <w:rPr>
@@ -13199,39 +12934,7 @@
           <w:i/>
           <w:iCs/>
         </w:rPr>
-        <w:t xml:space="preserve">Treat. Complex Trauma. Stress </w:t>
-      </w:r>
-      <w:proofErr w:type="spellStart"/>
-      <w:r>
-        <w:rPr>
-          <w:i/>
-          <w:iCs/>
-        </w:rPr>
-        <w:t>Disord</w:t>
-      </w:r>
-      <w:proofErr w:type="spellEnd"/>
-      <w:r>
-        <w:rPr>
-          <w:i/>
-          <w:iCs/>
-        </w:rPr>
-        <w:t xml:space="preserve">. </w:t>
-      </w:r>
-      <w:proofErr w:type="gramStart"/>
-      <w:r>
-        <w:rPr>
-          <w:i/>
-          <w:iCs/>
-        </w:rPr>
-        <w:t>Evid.-</w:t>
-      </w:r>
-      <w:proofErr w:type="gramEnd"/>
-      <w:r>
-        <w:rPr>
-          <w:i/>
-          <w:iCs/>
-        </w:rPr>
-        <w:t>Based Guide 415-440</w:t>
+        <w:t>Treat. Complex Trauma. Stress Disord. Evid.-Based Guide 415-440</w:t>
       </w:r>
       <w:r>
         <w:t xml:space="preserve"> (2009).</w:t>
@@ -13252,14 +12955,7 @@
       </w:r>
       <w:r>
         <w:tab/>
-      </w:r>
-      <w:proofErr w:type="spellStart"/>
-      <w:r>
-        <w:t>Keitner</w:t>
-      </w:r>
-      <w:proofErr w:type="spellEnd"/>
-      <w:r>
-        <w:t xml:space="preserve">, G. I. </w:t>
+        <w:t xml:space="preserve">Keitner, G. I. </w:t>
       </w:r>
       <w:r>
         <w:rPr>
@@ -13307,37 +13003,14 @@
       </w:r>
       <w:r>
         <w:tab/>
-      </w:r>
-      <w:proofErr w:type="spellStart"/>
-      <w:r>
-        <w:t>McDermut</w:t>
-      </w:r>
-      <w:proofErr w:type="spellEnd"/>
-      <w:r>
-        <w:t xml:space="preserve">, W., Miller, I. W. &amp; Brown, R. A. The efficacy of group psychotherapy for depression: A meta-analysis and review of the empirical research. </w:t>
+        <w:t xml:space="preserve">McDermut, W., Miller, I. W. &amp; Brown, R. A. The efficacy of group psychotherapy for depression: A meta-analysis and review of the empirical research. </w:t>
       </w:r>
       <w:r>
         <w:rPr>
           <w:i/>
           <w:iCs/>
         </w:rPr>
-        <w:t xml:space="preserve">Clin. Psychol. Sci. </w:t>
-      </w:r>
-      <w:proofErr w:type="spellStart"/>
-      <w:r>
-        <w:rPr>
-          <w:i/>
-          <w:iCs/>
-        </w:rPr>
-        <w:t>Pract</w:t>
-      </w:r>
-      <w:proofErr w:type="spellEnd"/>
-      <w:r>
-        <w:rPr>
-          <w:i/>
-          <w:iCs/>
-        </w:rPr>
-        <w:t>.</w:t>
+        <w:t>Clin. Psychol. Sci. Pract.</w:t>
       </w:r>
       <w:r>
         <w:t xml:space="preserve"> </w:t>
@@ -13368,54 +13041,14 @@
       </w:r>
       <w:r>
         <w:tab/>
-        <w:t xml:space="preserve">Gibson, R. W., D’Amico, M., Jaffe, L. &amp; </w:t>
-      </w:r>
-      <w:proofErr w:type="spellStart"/>
-      <w:r>
-        <w:t>Arbesman</w:t>
-      </w:r>
-      <w:proofErr w:type="spellEnd"/>
-      <w:r>
-        <w:t xml:space="preserve">, M. Occupational therapy interventions for recovery in the areas of community integration and normative life roles for adults with serious mental illness: A systematic review. </w:t>
+        <w:t xml:space="preserve">Gibson, R. W., D’Amico, M., Jaffe, L. &amp; Arbesman, M. Occupational therapy interventions for recovery in the areas of community integration and normative life roles for adults with serious mental illness: A systematic review. </w:t>
       </w:r>
       <w:r>
         <w:rPr>
           <w:i/>
           <w:iCs/>
         </w:rPr>
-        <w:t xml:space="preserve">Am. J. </w:t>
-      </w:r>
-      <w:proofErr w:type="spellStart"/>
-      <w:r>
-        <w:rPr>
-          <w:i/>
-          <w:iCs/>
-        </w:rPr>
-        <w:t>Occup</w:t>
-      </w:r>
-      <w:proofErr w:type="spellEnd"/>
-      <w:r>
-        <w:rPr>
-          <w:i/>
-          <w:iCs/>
-        </w:rPr>
-        <w:t xml:space="preserve">. </w:t>
-      </w:r>
-      <w:proofErr w:type="spellStart"/>
-      <w:r>
-        <w:rPr>
-          <w:i/>
-          <w:iCs/>
-        </w:rPr>
-        <w:t>Ther</w:t>
-      </w:r>
-      <w:proofErr w:type="spellEnd"/>
-      <w:r>
-        <w:rPr>
-          <w:i/>
-          <w:iCs/>
-        </w:rPr>
-        <w:t>.</w:t>
+        <w:t>Am. J. Occup. Ther.</w:t>
       </w:r>
       <w:r>
         <w:t xml:space="preserve"> </w:t>
@@ -13481,39 +13114,7 @@
           <w:i/>
           <w:iCs/>
         </w:rPr>
-        <w:t xml:space="preserve">J. </w:t>
-      </w:r>
-      <w:proofErr w:type="spellStart"/>
-      <w:r>
-        <w:rPr>
-          <w:i/>
-          <w:iCs/>
-        </w:rPr>
-        <w:t>Psychother</w:t>
-      </w:r>
-      <w:proofErr w:type="spellEnd"/>
-      <w:r>
-        <w:rPr>
-          <w:i/>
-          <w:iCs/>
-        </w:rPr>
-        <w:t xml:space="preserve">. </w:t>
-      </w:r>
-      <w:proofErr w:type="spellStart"/>
-      <w:r>
-        <w:rPr>
-          <w:i/>
-          <w:iCs/>
-        </w:rPr>
-        <w:t>Pract</w:t>
-      </w:r>
-      <w:proofErr w:type="spellEnd"/>
-      <w:r>
-        <w:rPr>
-          <w:i/>
-          <w:iCs/>
-        </w:rPr>
-        <w:t>. Res.</w:t>
+        <w:t>J. Psychother. Pract. Res.</w:t>
       </w:r>
       <w:r>
         <w:t xml:space="preserve"> </w:t>
@@ -13544,14 +13145,7 @@
       </w:r>
       <w:r>
         <w:tab/>
-      </w:r>
-      <w:proofErr w:type="spellStart"/>
-      <w:r>
-        <w:t>Strupp</w:t>
-      </w:r>
-      <w:proofErr w:type="spellEnd"/>
-      <w:r>
-        <w:t xml:space="preserve">, H. H., Hadley, S. W. &amp; Gomes-Schwartz, B. </w:t>
+        <w:t xml:space="preserve">Strupp, H. H., Hadley, S. W. &amp; Gomes-Schwartz, B. </w:t>
       </w:r>
       <w:r>
         <w:rPr>
@@ -13579,38 +13173,14 @@
       </w:r>
       <w:r>
         <w:tab/>
-      </w:r>
-      <w:proofErr w:type="spellStart"/>
-      <w:r>
-        <w:t>Barkowski</w:t>
-      </w:r>
-      <w:proofErr w:type="spellEnd"/>
-      <w:r>
-        <w:t xml:space="preserve">, S., </w:t>
-      </w:r>
-      <w:proofErr w:type="spellStart"/>
-      <w:r>
-        <w:t>Schwartze</w:t>
-      </w:r>
-      <w:proofErr w:type="spellEnd"/>
-      <w:r>
-        <w:t xml:space="preserve">, D., Strauss, B., Burlingame, G. M. &amp; Rosendahl, J. Efficacy of group psychotherapy for anxiety disorders: A systematic review and meta-analysis. </w:t>
-      </w:r>
-      <w:proofErr w:type="spellStart"/>
+        <w:t xml:space="preserve">Barkowski, S., Schwartze, D., Strauss, B., Burlingame, G. M. &amp; Rosendahl, J. Efficacy of group psychotherapy for anxiety disorders: A systematic review and meta-analysis. </w:t>
+      </w:r>
       <w:r>
         <w:rPr>
           <w:i/>
           <w:iCs/>
         </w:rPr>
-        <w:t>Psychother</w:t>
-      </w:r>
-      <w:proofErr w:type="spellEnd"/>
-      <w:r>
-        <w:rPr>
-          <w:i/>
-          <w:iCs/>
-        </w:rPr>
-        <w:t>. Res.</w:t>
+        <w:t>Psychother. Res.</w:t>
       </w:r>
       <w:r>
         <w:t xml:space="preserve"> </w:t>
@@ -13641,15 +13211,7 @@
       </w:r>
       <w:r>
         <w:tab/>
-        <w:t xml:space="preserve">McLaughlin, S. P. B., </w:t>
-      </w:r>
-      <w:proofErr w:type="spellStart"/>
-      <w:r>
-        <w:t>Barkowski</w:t>
-      </w:r>
-      <w:proofErr w:type="spellEnd"/>
-      <w:r>
-        <w:t xml:space="preserve">, S., Burlingame, G. M., Strauss, B. &amp; Rosendahl, J. Group psychotherapy for borderline personality disorder: A meta-analysis of randomized-controlled trials. </w:t>
+        <w:t xml:space="preserve">McLaughlin, S. P. B., Barkowski, S., Burlingame, G. M., Strauss, B. &amp; Rosendahl, J. Group psychotherapy for borderline personality disorder: A meta-analysis of randomized-controlled trials. </w:t>
       </w:r>
       <w:r>
         <w:rPr>
@@ -13687,46 +13249,7 @@
       </w:r>
       <w:r>
         <w:tab/>
-      </w:r>
-      <w:proofErr w:type="spellStart"/>
-      <w:r>
-        <w:t>Segredou</w:t>
-      </w:r>
-      <w:proofErr w:type="spellEnd"/>
-      <w:r>
-        <w:t xml:space="preserve">, E., </w:t>
-      </w:r>
-      <w:proofErr w:type="spellStart"/>
-      <w:r>
-        <w:t>Livaditis</w:t>
-      </w:r>
-      <w:proofErr w:type="spellEnd"/>
-      <w:r>
-        <w:t xml:space="preserve">, M., </w:t>
-      </w:r>
-      <w:proofErr w:type="spellStart"/>
-      <w:r>
-        <w:t>Liolios</w:t>
-      </w:r>
-      <w:proofErr w:type="spellEnd"/>
-      <w:r>
-        <w:t xml:space="preserve">, K. &amp; </w:t>
-      </w:r>
-      <w:proofErr w:type="spellStart"/>
-      <w:r>
-        <w:t>Skartsila</w:t>
-      </w:r>
-      <w:proofErr w:type="spellEnd"/>
-      <w:r>
-        <w:t xml:space="preserve">, G. Group </w:t>
-      </w:r>
-      <w:proofErr w:type="spellStart"/>
-      <w:r>
-        <w:t>programmes</w:t>
-      </w:r>
-      <w:proofErr w:type="spellEnd"/>
-      <w:r>
-        <w:t xml:space="preserve"> for recovery from psychosis: a systematic review. </w:t>
+        <w:t xml:space="preserve">Segredou, E., Livaditis, M., Liolios, K. &amp; Skartsila, G. Group programmes for recovery from psychosis: a systematic review. </w:t>
       </w:r>
       <w:r>
         <w:rPr>
@@ -13764,46 +13287,7 @@
       </w:r>
       <w:r>
         <w:tab/>
-      </w:r>
-      <w:proofErr w:type="spellStart"/>
-      <w:r>
-        <w:t>Bøg</w:t>
-      </w:r>
-      <w:proofErr w:type="spellEnd"/>
-      <w:r>
-        <w:t xml:space="preserve">, M., </w:t>
-      </w:r>
-      <w:proofErr w:type="spellStart"/>
-      <w:r>
-        <w:t>Filges</w:t>
-      </w:r>
-      <w:proofErr w:type="spellEnd"/>
-      <w:r>
-        <w:t xml:space="preserve">, T., </w:t>
-      </w:r>
-      <w:proofErr w:type="spellStart"/>
-      <w:r>
-        <w:t>Brännström</w:t>
-      </w:r>
-      <w:proofErr w:type="spellEnd"/>
-      <w:r>
-        <w:t xml:space="preserve">, L., </w:t>
-      </w:r>
-      <w:proofErr w:type="spellStart"/>
-      <w:r>
-        <w:t>Jørgensen</w:t>
-      </w:r>
-      <w:proofErr w:type="spellEnd"/>
-      <w:r>
-        <w:t xml:space="preserve">, A.-M. K. &amp; </w:t>
-      </w:r>
-      <w:proofErr w:type="spellStart"/>
-      <w:r>
-        <w:t>Fredrikksson</w:t>
-      </w:r>
-      <w:proofErr w:type="spellEnd"/>
-      <w:r>
-        <w:t xml:space="preserve">, M. K. 12-step programs for reducing illicit drug use. </w:t>
+        <w:t xml:space="preserve">Bøg, M., Filges, T., Brännström, L., Jørgensen, A.-M. K. &amp; Fredrikksson, M. K. 12-step programs for reducing illicit drug use. </w:t>
       </w:r>
       <w:r>
         <w:rPr>
@@ -13841,22 +13325,7 @@
       </w:r>
       <w:r>
         <w:tab/>
-      </w:r>
-      <w:proofErr w:type="spellStart"/>
-      <w:r>
-        <w:t>Munthe</w:t>
-      </w:r>
-      <w:proofErr w:type="spellEnd"/>
-      <w:r>
-        <w:t xml:space="preserve">-Kaas, H. M., Berg, R. C. &amp; </w:t>
-      </w:r>
-      <w:proofErr w:type="spellStart"/>
-      <w:r>
-        <w:t>Blaasvær</w:t>
-      </w:r>
-      <w:proofErr w:type="spellEnd"/>
-      <w:r>
-        <w:t xml:space="preserve">, N. Effectiveness of interventions to reduce homelessness: a systematic review and meta-analysis. </w:t>
+        <w:t xml:space="preserve">Munthe-Kaas, H. M., Berg, R. C. &amp; Blaasvær, N. Effectiveness of interventions to reduce homelessness: a systematic review and meta-analysis. </w:t>
       </w:r>
       <w:r>
         <w:rPr>
@@ -13894,70 +13363,14 @@
       </w:r>
       <w:r>
         <w:tab/>
-        <w:t xml:space="preserve">Mahoney, A., </w:t>
-      </w:r>
-      <w:proofErr w:type="spellStart"/>
-      <w:r>
-        <w:t>Karatzias</w:t>
-      </w:r>
-      <w:proofErr w:type="spellEnd"/>
-      <w:r>
-        <w:t xml:space="preserve">, T., Hutton, &amp; P. A systematic review and meta-analysis of group treatments for adults with symptoms associated with complex post-traumatic stress disorder. </w:t>
+        <w:t xml:space="preserve">Mahoney, A., Karatzias, T., Hutton, &amp; P. A systematic review and meta-analysis of group treatments for adults with symptoms associated with complex post-traumatic stress disorder. </w:t>
       </w:r>
       <w:r>
         <w:rPr>
           <w:i/>
           <w:iCs/>
         </w:rPr>
-        <w:t xml:space="preserve">J. Affect. </w:t>
-      </w:r>
-      <w:proofErr w:type="spellStart"/>
-      <w:r>
-        <w:rPr>
-          <w:i/>
-          <w:iCs/>
-        </w:rPr>
-        <w:t>Disord</w:t>
-      </w:r>
-      <w:proofErr w:type="spellEnd"/>
-      <w:r>
-        <w:rPr>
-          <w:i/>
-          <w:iCs/>
-        </w:rPr>
-        <w:t xml:space="preserve">. 243 305–321Reproducibility </w:t>
-      </w:r>
-      <w:proofErr w:type="spellStart"/>
-      <w:r>
-        <w:rPr>
-          <w:i/>
-          <w:iCs/>
-        </w:rPr>
-        <w:t>Individ</w:t>
-      </w:r>
-      <w:proofErr w:type="spellEnd"/>
-      <w:r>
-        <w:rPr>
-          <w:i/>
-          <w:iCs/>
-        </w:rPr>
-        <w:t xml:space="preserve">. Eff. Sizes Meta-Anal. Psychol. </w:t>
-      </w:r>
-      <w:proofErr w:type="spellStart"/>
-      <w:r>
-        <w:rPr>
-          <w:i/>
-          <w:iCs/>
-        </w:rPr>
-        <w:t>PloS</w:t>
-      </w:r>
-      <w:proofErr w:type="spellEnd"/>
-      <w:r>
-        <w:rPr>
-          <w:i/>
-          <w:iCs/>
-        </w:rPr>
-        <w:t xml:space="preserve"> One</w:t>
+        <w:t>J. Affect. Disord. 243 305–321Reproducibility Individ. Eff. Sizes Meta-Anal. Psychol. PloS One</w:t>
       </w:r>
       <w:r>
         <w:t xml:space="preserve"> </w:t>
@@ -14036,15 +13449,7 @@
       </w:r>
       <w:r>
         <w:tab/>
-        <w:t xml:space="preserve">Kelly, J. F., Humphreys, K., </w:t>
-      </w:r>
-      <w:proofErr w:type="spellStart"/>
-      <w:r>
-        <w:t>Ferri</w:t>
-      </w:r>
-      <w:proofErr w:type="spellEnd"/>
-      <w:r>
-        <w:t xml:space="preserve">, &amp; M. Alcoholics anonymous and other 12-step programs for alcohol use disorder. </w:t>
+        <w:t xml:space="preserve">Kelly, J. F., Humphreys, K., Ferri, &amp; M. Alcoholics anonymous and other 12-step programs for alcohol use disorder. </w:t>
       </w:r>
       <w:r>
         <w:rPr>
@@ -14083,46 +13488,7 @@
       </w:r>
       <w:r>
         <w:tab/>
-      </w:r>
-      <w:proofErr w:type="spellStart"/>
-      <w:r>
-        <w:t>Dalgaard</w:t>
-      </w:r>
-      <w:proofErr w:type="spellEnd"/>
-      <w:r>
-        <w:t xml:space="preserve">, N. T., </w:t>
-      </w:r>
-      <w:proofErr w:type="spellStart"/>
-      <w:r>
-        <w:t>Flensborg</w:t>
-      </w:r>
-      <w:proofErr w:type="spellEnd"/>
-      <w:r>
-        <w:t xml:space="preserve"> Jensen, M. C., </w:t>
-      </w:r>
-      <w:proofErr w:type="spellStart"/>
-      <w:r>
-        <w:t>Bengtsen</w:t>
-      </w:r>
-      <w:proofErr w:type="spellEnd"/>
-      <w:r>
-        <w:t xml:space="preserve">, E., </w:t>
-      </w:r>
-      <w:proofErr w:type="spellStart"/>
-      <w:r>
-        <w:t>Krassel</w:t>
-      </w:r>
-      <w:proofErr w:type="spellEnd"/>
-      <w:r>
-        <w:t xml:space="preserve">, K. F. &amp; Vembye, M. H. PROTOCOL: Group‐based community interventions to support the social reintegration of </w:t>
-      </w:r>
-      <w:proofErr w:type="spellStart"/>
-      <w:r>
-        <w:t>marginalised</w:t>
-      </w:r>
-      <w:proofErr w:type="spellEnd"/>
-      <w:r>
-        <w:t xml:space="preserve"> adults with mental illness. </w:t>
+        <w:t xml:space="preserve">Dalgaard, N. T., Flensborg Jensen, M. C., Bengtsen, E., Krassel, K. F. &amp; Vembye, M. H. PROTOCOL: Group‐based community interventions to support the social reintegration of marginalised adults with mental illness. </w:t>
       </w:r>
       <w:r>
         <w:rPr>
@@ -14160,14 +13526,7 @@
       </w:r>
       <w:r>
         <w:tab/>
-      </w:r>
-      <w:proofErr w:type="spellStart"/>
-      <w:r>
-        <w:t>Beames</w:t>
-      </w:r>
-      <w:proofErr w:type="spellEnd"/>
-      <w:r>
-        <w:t xml:space="preserve"> L </w:t>
+        <w:t xml:space="preserve">Beames L </w:t>
       </w:r>
       <w:r>
         <w:rPr>
@@ -14177,31 +13536,14 @@
         <w:t>et al.</w:t>
       </w:r>
       <w:r>
-        <w:t xml:space="preserve"> A Feasibility Study of the Translation of Cognitive </w:t>
-      </w:r>
-      <w:proofErr w:type="spellStart"/>
-      <w:r>
-        <w:t>Behaviour</w:t>
-      </w:r>
-      <w:proofErr w:type="spellEnd"/>
-      <w:r>
-        <w:t xml:space="preserve"> Therapy for Psychosis into an Australian Adult Mental Health Clinical Setting. </w:t>
-      </w:r>
-      <w:proofErr w:type="spellStart"/>
+        <w:t xml:space="preserve"> A Feasibility Study of the Translation of Cognitive Behaviour Therapy for Psychosis into an Australian Adult Mental Health Clinical Setting. </w:t>
+      </w:r>
       <w:r>
         <w:rPr>
           <w:i/>
           <w:iCs/>
         </w:rPr>
-        <w:t>Behav</w:t>
-      </w:r>
-      <w:proofErr w:type="spellEnd"/>
-      <w:r>
-        <w:rPr>
-          <w:i/>
-          <w:iCs/>
-        </w:rPr>
-        <w:t>. Change</w:t>
+        <w:t>Behav. Change</w:t>
       </w:r>
       <w:r>
         <w:t xml:space="preserve"> </w:t>
@@ -14232,14 +13574,7 @@
       </w:r>
       <w:r>
         <w:tab/>
-      </w:r>
-      <w:proofErr w:type="spellStart"/>
-      <w:r>
-        <w:t>Cano-Vindel</w:t>
-      </w:r>
-      <w:proofErr w:type="spellEnd"/>
-      <w:r>
-        <w:t xml:space="preserve">, A. </w:t>
+        <w:t xml:space="preserve">Cano-Vindel, A. </w:t>
       </w:r>
       <w:r>
         <w:rPr>
@@ -14249,23 +13584,7 @@
         <w:t>et al.</w:t>
       </w:r>
       <w:r>
-        <w:t xml:space="preserve"> Transdiagnostic group cognitive </w:t>
-      </w:r>
-      <w:proofErr w:type="spellStart"/>
-      <w:r>
-        <w:t>behavioural</w:t>
-      </w:r>
-      <w:proofErr w:type="spellEnd"/>
-      <w:r>
-        <w:t xml:space="preserve"> therapy for emotional disorders in primary care: the results of the </w:t>
-      </w:r>
-      <w:proofErr w:type="spellStart"/>
-      <w:r>
-        <w:t>PsicAP</w:t>
-      </w:r>
-      <w:proofErr w:type="spellEnd"/>
-      <w:r>
-        <w:t xml:space="preserve"> randomized controlled trial. </w:t>
+        <w:t xml:space="preserve"> Transdiagnostic group cognitive behavioural therapy for emotional disorders in primary care: the results of the PsicAP randomized controlled trial. </w:t>
       </w:r>
       <w:r>
         <w:rPr>
@@ -14305,37 +13624,12 @@
         <w:tab/>
         <w:t xml:space="preserve">Craigie, M. A. &amp; Nathan, P. A Nonrandomized Effectiveness Comparison of Broad-Spectrum Group CBT to Individual CBT for Depressed Outpatients in a Community Mental Health Setting. </w:t>
       </w:r>
-      <w:proofErr w:type="spellStart"/>
       <w:r>
         <w:rPr>
           <w:i/>
           <w:iCs/>
         </w:rPr>
-        <w:t>Behav</w:t>
-      </w:r>
-      <w:proofErr w:type="spellEnd"/>
-      <w:r>
-        <w:rPr>
-          <w:i/>
-          <w:iCs/>
-        </w:rPr>
-        <w:t xml:space="preserve">. </w:t>
-      </w:r>
-      <w:proofErr w:type="spellStart"/>
-      <w:r>
-        <w:rPr>
-          <w:i/>
-          <w:iCs/>
-        </w:rPr>
-        <w:t>Ther</w:t>
-      </w:r>
-      <w:proofErr w:type="spellEnd"/>
-      <w:r>
-        <w:rPr>
-          <w:i/>
-          <w:iCs/>
-        </w:rPr>
-        <w:t>.</w:t>
+        <w:t>Behav. Ther.</w:t>
       </w:r>
       <w:r>
         <w:t xml:space="preserve"> </w:t>
@@ -14366,79 +13660,14 @@
       </w:r>
       <w:r>
         <w:tab/>
-        <w:t xml:space="preserve">Hagen, R., </w:t>
-      </w:r>
-      <w:proofErr w:type="spellStart"/>
-      <w:r>
-        <w:t>Nordahl</w:t>
-      </w:r>
-      <w:proofErr w:type="spellEnd"/>
-      <w:r>
-        <w:t xml:space="preserve">, H. M., Kristiansen, L. &amp; </w:t>
-      </w:r>
-      <w:proofErr w:type="spellStart"/>
-      <w:r>
-        <w:t>Morken</w:t>
-      </w:r>
-      <w:proofErr w:type="spellEnd"/>
-      <w:r>
-        <w:t xml:space="preserve">, G. A Randomized Trial of Cognitive Group Therapy vs. Waiting List for Patients with Co-Morbid Psychiatric Disorders: Effect of Cognitive Group Therapy after Treatment and </w:t>
-      </w:r>
-      <w:proofErr w:type="gramStart"/>
-      <w:r>
-        <w:t>Six and Twelve Months</w:t>
-      </w:r>
-      <w:proofErr w:type="gramEnd"/>
-      <w:r>
-        <w:t xml:space="preserve"> Follow-Up. </w:t>
-      </w:r>
-      <w:proofErr w:type="spellStart"/>
+        <w:t xml:space="preserve">Hagen, R., Nordahl, H. M., Kristiansen, L. &amp; Morken, G. A Randomized Trial of Cognitive Group Therapy vs. Waiting List for Patients with Co-Morbid Psychiatric Disorders: Effect of Cognitive Group Therapy after Treatment and Six and Twelve Months Follow-Up. </w:t>
+      </w:r>
       <w:r>
         <w:rPr>
           <w:i/>
           <w:iCs/>
         </w:rPr>
-        <w:t>Behav</w:t>
-      </w:r>
-      <w:proofErr w:type="spellEnd"/>
-      <w:r>
-        <w:rPr>
-          <w:i/>
-          <w:iCs/>
-        </w:rPr>
-        <w:t xml:space="preserve">. </w:t>
-      </w:r>
-      <w:proofErr w:type="spellStart"/>
-      <w:r>
-        <w:rPr>
-          <w:i/>
-          <w:iCs/>
-        </w:rPr>
-        <w:t>Cogn</w:t>
-      </w:r>
-      <w:proofErr w:type="spellEnd"/>
-      <w:r>
-        <w:rPr>
-          <w:i/>
-          <w:iCs/>
-        </w:rPr>
-        <w:t xml:space="preserve">. </w:t>
-      </w:r>
-      <w:proofErr w:type="spellStart"/>
-      <w:r>
-        <w:rPr>
-          <w:i/>
-          <w:iCs/>
-        </w:rPr>
-        <w:t>Psychother</w:t>
-      </w:r>
-      <w:proofErr w:type="spellEnd"/>
-      <w:r>
-        <w:rPr>
-          <w:i/>
-          <w:iCs/>
-        </w:rPr>
-        <w:t>.</w:t>
+        <w:t>Behav. Cogn. Psychother.</w:t>
       </w:r>
       <w:r>
         <w:t xml:space="preserve"> </w:t>
@@ -14469,15 +13698,7 @@
       </w:r>
       <w:r>
         <w:tab/>
-        <w:t>Halperin Stephen, Nathan Paula, Drummond Peter, &amp; Castle David. A cognitive-</w:t>
-      </w:r>
-      <w:proofErr w:type="spellStart"/>
-      <w:r>
-        <w:t>behavioural</w:t>
-      </w:r>
-      <w:proofErr w:type="spellEnd"/>
-      <w:r>
-        <w:t xml:space="preserve">, group-based intervention for social anxiety in schizophrenia. </w:t>
+        <w:t xml:space="preserve">Halperin Stephen, Nathan Paula, Drummond Peter, &amp; Castle David. A cognitive-behavioural, group-based intervention for social anxiety in schizophrenia. </w:t>
       </w:r>
       <w:r>
         <w:rPr>
@@ -14515,14 +13736,7 @@
       </w:r>
       <w:r>
         <w:tab/>
-      </w:r>
-      <w:proofErr w:type="spellStart"/>
-      <w:r>
-        <w:t>Himle</w:t>
-      </w:r>
-      <w:proofErr w:type="spellEnd"/>
-      <w:r>
-        <w:t xml:space="preserve">, J. </w:t>
+        <w:t xml:space="preserve">Himle, J. </w:t>
       </w:r>
       <w:r>
         <w:rPr>
@@ -14534,37 +13748,12 @@
       <w:r>
         <w:t xml:space="preserve"> Work-related CBT versus vocational services as usual for unemployed persons with social anxiety disorder: A randomized controlled pilot trial. </w:t>
       </w:r>
-      <w:proofErr w:type="spellStart"/>
       <w:r>
         <w:rPr>
           <w:i/>
           <w:iCs/>
         </w:rPr>
-        <w:t>Behav</w:t>
-      </w:r>
-      <w:proofErr w:type="spellEnd"/>
-      <w:r>
-        <w:rPr>
-          <w:i/>
-          <w:iCs/>
-        </w:rPr>
-        <w:t xml:space="preserve">. Res. </w:t>
-      </w:r>
-      <w:proofErr w:type="spellStart"/>
-      <w:r>
-        <w:rPr>
-          <w:i/>
-          <w:iCs/>
-        </w:rPr>
-        <w:t>Ther</w:t>
-      </w:r>
-      <w:proofErr w:type="spellEnd"/>
-      <w:r>
-        <w:rPr>
-          <w:i/>
-          <w:iCs/>
-        </w:rPr>
-        <w:t>.</w:t>
+        <w:t>Behav. Res. Ther.</w:t>
       </w:r>
       <w:r>
         <w:t xml:space="preserve"> </w:t>
@@ -14607,21 +13796,12 @@
       <w:r>
         <w:t xml:space="preserve"> A multi-center, randomized controlled trial of a group psychological intervention for psychosis with comorbid cannabis dependence over the early course of illness. </w:t>
       </w:r>
-      <w:proofErr w:type="spellStart"/>
       <w:r>
         <w:rPr>
           <w:i/>
           <w:iCs/>
         </w:rPr>
-        <w:t>Schizophr</w:t>
-      </w:r>
-      <w:proofErr w:type="spellEnd"/>
-      <w:r>
-        <w:rPr>
-          <w:i/>
-          <w:iCs/>
-        </w:rPr>
-        <w:t>. Res.</w:t>
+        <w:t>Schizophr. Res.</w:t>
       </w:r>
       <w:r>
         <w:t xml:space="preserve"> </w:t>
@@ -14690,14 +13870,7 @@
       </w:r>
       <w:r>
         <w:tab/>
-      </w:r>
-      <w:proofErr w:type="spellStart"/>
-      <w:r>
-        <w:t>Rabenstein</w:t>
-      </w:r>
-      <w:proofErr w:type="spellEnd"/>
-      <w:r>
-        <w:t xml:space="preserve">, R. </w:t>
+        <w:t xml:space="preserve">Rabenstein, R. </w:t>
       </w:r>
       <w:r>
         <w:rPr>
@@ -14707,17 +13880,8 @@
         <w:t>et al.</w:t>
       </w:r>
       <w:r>
-        <w:t xml:space="preserve"> Effectiveness of a cognitive-behavioral rehabilitation day clinic program - A waiting </w:t>
-      </w:r>
-      <w:proofErr w:type="gramStart"/>
-      <w:r>
-        <w:t>list controlled</w:t>
-      </w:r>
-      <w:proofErr w:type="gramEnd"/>
-      <w:r>
-        <w:t xml:space="preserve"> trial. </w:t>
-      </w:r>
-      <w:proofErr w:type="spellStart"/>
+        <w:t xml:space="preserve"> Effectiveness of a cognitive-behavioral rehabilitation day clinic program - A waiting list controlled trial. </w:t>
+      </w:r>
       <w:r>
         <w:rPr>
           <w:i/>
@@ -14725,7 +13889,6 @@
         </w:rPr>
         <w:t>Verhaltenstherapie</w:t>
       </w:r>
-      <w:proofErr w:type="spellEnd"/>
       <w:r>
         <w:t xml:space="preserve"> </w:t>
       </w:r>
@@ -14755,46 +13918,14 @@
       </w:r>
       <w:r>
         <w:tab/>
-        <w:t xml:space="preserve">Smith, R., Wuthrich, V., </w:t>
-      </w:r>
-      <w:proofErr w:type="spellStart"/>
-      <w:r>
-        <w:t>Johnco</w:t>
-      </w:r>
-      <w:proofErr w:type="spellEnd"/>
-      <w:r>
-        <w:t xml:space="preserve">, C. &amp; Belcher, J. Effect of group cognitive </w:t>
-      </w:r>
-      <w:proofErr w:type="spellStart"/>
-      <w:r>
-        <w:t>behavioural</w:t>
-      </w:r>
-      <w:proofErr w:type="spellEnd"/>
-      <w:r>
-        <w:t xml:space="preserve"> therapy on loneliness in a community sample of older adults: A secondary analysis of a randomized controlled trial. </w:t>
+        <w:t xml:space="preserve">Smith, R., Wuthrich, V., Johnco, C. &amp; Belcher, J. Effect of group cognitive behavioural therapy on loneliness in a community sample of older adults: A secondary analysis of a randomized controlled trial. </w:t>
       </w:r>
       <w:r>
         <w:rPr>
           <w:i/>
           <w:iCs/>
         </w:rPr>
-        <w:t xml:space="preserve">Clin. </w:t>
-      </w:r>
-      <w:proofErr w:type="spellStart"/>
-      <w:r>
-        <w:rPr>
-          <w:i/>
-          <w:iCs/>
-        </w:rPr>
-        <w:t>Gerontol</w:t>
-      </w:r>
-      <w:proofErr w:type="spellEnd"/>
-      <w:r>
-        <w:rPr>
-          <w:i/>
-          <w:iCs/>
-        </w:rPr>
-        <w:t>.</w:t>
+        <w:t>Clin. Gerontol.</w:t>
       </w:r>
       <w:r>
         <w:t xml:space="preserve"> </w:t>
@@ -14825,63 +13956,14 @@
       </w:r>
       <w:r>
         <w:tab/>
-        <w:t xml:space="preserve">Wuthrich, V. M. &amp; </w:t>
-      </w:r>
-      <w:proofErr w:type="spellStart"/>
-      <w:r>
-        <w:t>Rapee</w:t>
-      </w:r>
-      <w:proofErr w:type="spellEnd"/>
-      <w:r>
-        <w:t xml:space="preserve">, R. M. </w:t>
-      </w:r>
-      <w:proofErr w:type="spellStart"/>
-      <w:r>
-        <w:t>Randomised</w:t>
-      </w:r>
-      <w:proofErr w:type="spellEnd"/>
-      <w:r>
-        <w:t xml:space="preserve"> controlled trial of group cognitive </w:t>
-      </w:r>
-      <w:proofErr w:type="spellStart"/>
-      <w:r>
-        <w:t>behavioural</w:t>
-      </w:r>
-      <w:proofErr w:type="spellEnd"/>
-      <w:r>
-        <w:t xml:space="preserve"> therapy for comorbid anxiety and depression in older adults. </w:t>
-      </w:r>
-      <w:proofErr w:type="spellStart"/>
+        <w:t xml:space="preserve">Wuthrich, V. M. &amp; Rapee, R. M. Randomised controlled trial of group cognitive behavioural therapy for comorbid anxiety and depression in older adults. </w:t>
+      </w:r>
       <w:r>
         <w:rPr>
           <w:i/>
           <w:iCs/>
         </w:rPr>
-        <w:t>Behav</w:t>
-      </w:r>
-      <w:proofErr w:type="spellEnd"/>
-      <w:r>
-        <w:rPr>
-          <w:i/>
-          <w:iCs/>
-        </w:rPr>
-        <w:t xml:space="preserve">. Res. </w:t>
-      </w:r>
-      <w:proofErr w:type="spellStart"/>
-      <w:r>
-        <w:rPr>
-          <w:i/>
-          <w:iCs/>
-        </w:rPr>
-        <w:t>Ther</w:t>
-      </w:r>
-      <w:proofErr w:type="spellEnd"/>
-      <w:r>
-        <w:rPr>
-          <w:i/>
-          <w:iCs/>
-        </w:rPr>
-        <w:t>.</w:t>
+        <w:t>Behav. Res. Ther.</w:t>
       </w:r>
       <w:r>
         <w:t xml:space="preserve"> </w:t>
@@ -14912,14 +13994,7 @@
       </w:r>
       <w:r>
         <w:tab/>
-      </w:r>
-      <w:proofErr w:type="spellStart"/>
-      <w:r>
-        <w:t>Yanos</w:t>
-      </w:r>
-      <w:proofErr w:type="spellEnd"/>
-      <w:r>
-        <w:t xml:space="preserve"> Philip T, Roe David, West Michelle L, Smith Stephen M, &amp; Lysaker Paul H. Group-based treatment for internalized stigma among persons with severe mental illness: Findings from a randomized controlled trial. </w:t>
+        <w:t xml:space="preserve">Yanos Philip T, Roe David, West Michelle L, Smith Stephen M, &amp; Lysaker Paul H. Group-based treatment for internalized stigma among persons with severe mental illness: Findings from a randomized controlled trial. </w:t>
       </w:r>
       <w:r>
         <w:rPr>
@@ -14957,14 +14032,7 @@
       </w:r>
       <w:r>
         <w:tab/>
-      </w:r>
-      <w:proofErr w:type="spellStart"/>
-      <w:r>
-        <w:t>Acarturk</w:t>
-      </w:r>
-      <w:proofErr w:type="spellEnd"/>
-      <w:r>
-        <w:t xml:space="preserve">, C. </w:t>
+        <w:t xml:space="preserve">Acarturk, C. </w:t>
       </w:r>
       <w:r>
         <w:rPr>
@@ -14974,15 +14042,7 @@
         <w:t>et al.</w:t>
       </w:r>
       <w:r>
-        <w:t xml:space="preserve"> Group problem management plus (PM+) to decrease psychological distress among Syrian refugees in Turkey: a pilot </w:t>
-      </w:r>
-      <w:proofErr w:type="spellStart"/>
-      <w:r>
-        <w:t>randomised</w:t>
-      </w:r>
-      <w:proofErr w:type="spellEnd"/>
-      <w:r>
-        <w:t xml:space="preserve"> controlled trial. </w:t>
+        <w:t xml:space="preserve"> Group problem management plus (PM+) to decrease psychological distress among Syrian refugees in Turkey: a pilot randomised controlled trial. </w:t>
       </w:r>
       <w:r>
         <w:rPr>
@@ -15020,30 +14080,14 @@
       </w:r>
       <w:r>
         <w:tab/>
-      </w:r>
-      <w:proofErr w:type="spellStart"/>
-      <w:r>
-        <w:t>Barbic</w:t>
-      </w:r>
-      <w:proofErr w:type="spellEnd"/>
-      <w:r>
-        <w:t xml:space="preserve">, S., Krupa, T. &amp; Armstrong, I. A randomized controlled trial of the effectiveness of a modified recovery workbook program: preliminary findings. </w:t>
-      </w:r>
-      <w:proofErr w:type="spellStart"/>
+        <w:t xml:space="preserve">Barbic, S., Krupa, T. &amp; Armstrong, I. A randomized controlled trial of the effectiveness of a modified recovery workbook program: preliminary findings. </w:t>
+      </w:r>
       <w:r>
         <w:rPr>
           <w:i/>
           <w:iCs/>
         </w:rPr>
-        <w:t>Psychiatr</w:t>
-      </w:r>
-      <w:proofErr w:type="spellEnd"/>
-      <w:r>
-        <w:rPr>
-          <w:i/>
-          <w:iCs/>
-        </w:rPr>
-        <w:t>. Serv.</w:t>
+        <w:t>Psychiatr. Serv.</w:t>
       </w:r>
       <w:r>
         <w:t xml:space="preserve"> </w:t>
@@ -15075,14 +14119,7 @@
       </w:r>
       <w:r>
         <w:tab/>
-      </w:r>
-      <w:proofErr w:type="spellStart"/>
-      <w:r>
-        <w:t>Burnam</w:t>
-      </w:r>
-      <w:proofErr w:type="spellEnd"/>
-      <w:r>
-        <w:t xml:space="preserve"> M Audrey </w:t>
+        <w:t xml:space="preserve">Burnam M Audrey </w:t>
       </w:r>
       <w:r>
         <w:rPr>
@@ -15137,23 +14174,7 @@
           <w:i/>
           <w:iCs/>
         </w:rPr>
-        <w:t xml:space="preserve">Am. J. </w:t>
-      </w:r>
-      <w:proofErr w:type="spellStart"/>
-      <w:r>
-        <w:rPr>
-          <w:i/>
-          <w:iCs/>
-        </w:rPr>
-        <w:t>Psychother</w:t>
-      </w:r>
-      <w:proofErr w:type="spellEnd"/>
-      <w:r>
-        <w:rPr>
-          <w:i/>
-          <w:iCs/>
-        </w:rPr>
-        <w:t>.</w:t>
+        <w:t>Am. J. Psychother.</w:t>
       </w:r>
       <w:r>
         <w:t xml:space="preserve"> </w:t>
@@ -15194,63 +14215,14 @@
         <w:t>et al.</w:t>
       </w:r>
       <w:r>
-        <w:t xml:space="preserve"> Pilot Effectiveness of a Stress Management Program for Sheltered Homeless Adults </w:t>
-      </w:r>
-      <w:proofErr w:type="gramStart"/>
-      <w:r>
-        <w:t>With</w:t>
-      </w:r>
-      <w:proofErr w:type="gramEnd"/>
-      <w:r>
-        <w:t xml:space="preserve"> Mental Illness: A Two-Group Controlled Study. </w:t>
-      </w:r>
-      <w:proofErr w:type="spellStart"/>
+        <w:t xml:space="preserve"> Pilot Effectiveness of a Stress Management Program for Sheltered Homeless Adults With Mental Illness: A Two-Group Controlled Study. </w:t>
+      </w:r>
       <w:r>
         <w:rPr>
           <w:i/>
           <w:iCs/>
         </w:rPr>
-        <w:t>Occup</w:t>
-      </w:r>
-      <w:proofErr w:type="spellEnd"/>
-      <w:r>
-        <w:rPr>
-          <w:i/>
-          <w:iCs/>
-        </w:rPr>
-        <w:t xml:space="preserve">. </w:t>
-      </w:r>
-      <w:proofErr w:type="spellStart"/>
-      <w:r>
-        <w:rPr>
-          <w:i/>
-          <w:iCs/>
-        </w:rPr>
-        <w:t>Ther</w:t>
-      </w:r>
-      <w:proofErr w:type="spellEnd"/>
-      <w:r>
-        <w:rPr>
-          <w:i/>
-          <w:iCs/>
-        </w:rPr>
-        <w:t xml:space="preserve">. </w:t>
-      </w:r>
-      <w:proofErr w:type="spellStart"/>
-      <w:r>
-        <w:rPr>
-          <w:i/>
-          <w:iCs/>
-        </w:rPr>
-        <w:t>Ment</w:t>
-      </w:r>
-      <w:proofErr w:type="spellEnd"/>
-      <w:r>
-        <w:rPr>
-          <w:i/>
-          <w:iCs/>
-        </w:rPr>
-        <w:t>. Health</w:t>
+        <w:t>Occup. Ther. Ment. Health</w:t>
       </w:r>
       <w:r>
         <w:t xml:space="preserve"> </w:t>
@@ -15329,38 +14301,14 @@
       </w:r>
       <w:r>
         <w:tab/>
-        <w:t xml:space="preserve">Munroe-Blum, H. &amp; </w:t>
-      </w:r>
-      <w:proofErr w:type="spellStart"/>
-      <w:r>
-        <w:t>Marziali</w:t>
-      </w:r>
-      <w:proofErr w:type="spellEnd"/>
-      <w:r>
-        <w:t xml:space="preserve">, E. A controlled trial of short-term group treatment for borderline personality disorder. </w:t>
+        <w:t xml:space="preserve">Munroe-Blum, H. &amp; Marziali, E. A controlled trial of short-term group treatment for borderline personality disorder. </w:t>
       </w:r>
       <w:r>
         <w:rPr>
           <w:i/>
           <w:iCs/>
         </w:rPr>
-        <w:t xml:space="preserve">J. Personal. </w:t>
-      </w:r>
-      <w:proofErr w:type="spellStart"/>
-      <w:r>
-        <w:rPr>
-          <w:i/>
-          <w:iCs/>
-        </w:rPr>
-        <w:t>Disord</w:t>
-      </w:r>
-      <w:proofErr w:type="spellEnd"/>
-      <w:r>
-        <w:rPr>
-          <w:i/>
-          <w:iCs/>
-        </w:rPr>
-        <w:t>.</w:t>
+        <w:t>J. Personal. Disord.</w:t>
       </w:r>
       <w:r>
         <w:t xml:space="preserve"> </w:t>
@@ -15408,23 +14356,7 @@
           <w:i/>
           <w:iCs/>
         </w:rPr>
-        <w:t xml:space="preserve">Psychol. </w:t>
-      </w:r>
-      <w:proofErr w:type="spellStart"/>
-      <w:r>
-        <w:rPr>
-          <w:i/>
-          <w:iCs/>
-        </w:rPr>
-        <w:t>Psychother</w:t>
-      </w:r>
-      <w:proofErr w:type="spellEnd"/>
-      <w:r>
-        <w:rPr>
-          <w:i/>
-          <w:iCs/>
-        </w:rPr>
-        <w:t>.</w:t>
+        <w:t>Psychol. Psychother.</w:t>
       </w:r>
       <w:r>
         <w:t xml:space="preserve"> </w:t>
@@ -15455,14 +14387,7 @@
       </w:r>
       <w:r>
         <w:tab/>
-      </w:r>
-      <w:proofErr w:type="spellStart"/>
-      <w:r>
-        <w:t>Vallina</w:t>
-      </w:r>
-      <w:proofErr w:type="spellEnd"/>
-      <w:r>
-        <w:t xml:space="preserve">-Fernandez, O. </w:t>
+        <w:t xml:space="preserve">Vallina-Fernandez, O. </w:t>
       </w:r>
       <w:r>
         <w:rPr>
@@ -15510,14 +14435,7 @@
       </w:r>
       <w:r>
         <w:tab/>
-      </w:r>
-      <w:proofErr w:type="spellStart"/>
-      <w:r>
-        <w:t>Druss</w:t>
-      </w:r>
-      <w:proofErr w:type="spellEnd"/>
-      <w:r>
-        <w:t xml:space="preserve">, B. G. </w:t>
+        <w:t xml:space="preserve">Druss, B. G. </w:t>
       </w:r>
       <w:r>
         <w:rPr>
@@ -15529,21 +14447,12 @@
       <w:r>
         <w:t xml:space="preserve"> The Health and Recovery Peer (HARP) Program: A peer-led intervention to improve medical self-management for persons with serious mental illness. </w:t>
       </w:r>
-      <w:proofErr w:type="spellStart"/>
       <w:r>
         <w:rPr>
           <w:i/>
           <w:iCs/>
         </w:rPr>
-        <w:t>Schizophr</w:t>
-      </w:r>
-      <w:proofErr w:type="spellEnd"/>
-      <w:r>
-        <w:rPr>
-          <w:i/>
-          <w:iCs/>
-        </w:rPr>
-        <w:t>. Res.</w:t>
+        <w:t>Schizophr. Res.</w:t>
       </w:r>
       <w:r>
         <w:t xml:space="preserve"> </w:t>
@@ -15574,14 +14483,7 @@
       </w:r>
       <w:r>
         <w:tab/>
-      </w:r>
-      <w:proofErr w:type="spellStart"/>
-      <w:r>
-        <w:t>Druss</w:t>
-      </w:r>
-      <w:proofErr w:type="spellEnd"/>
-      <w:r>
-        <w:t xml:space="preserve">, B. G. </w:t>
+        <w:t xml:space="preserve">Druss, B. G. </w:t>
       </w:r>
       <w:r>
         <w:rPr>
@@ -15591,31 +14493,14 @@
         <w:t>et al.</w:t>
       </w:r>
       <w:r>
-        <w:t xml:space="preserve"> Peer-Led Self-Management of General Medical Conditions for Patients </w:t>
-      </w:r>
-      <w:proofErr w:type="gramStart"/>
-      <w:r>
-        <w:t>With</w:t>
-      </w:r>
-      <w:proofErr w:type="gramEnd"/>
-      <w:r>
-        <w:t xml:space="preserve"> Serious Mental Illnesses: A Randomized Trial. </w:t>
-      </w:r>
-      <w:proofErr w:type="spellStart"/>
+        <w:t xml:space="preserve"> Peer-Led Self-Management of General Medical Conditions for Patients With Serious Mental Illnesses: A Randomized Trial. </w:t>
+      </w:r>
       <w:r>
         <w:rPr>
           <w:i/>
           <w:iCs/>
         </w:rPr>
-        <w:t>Psychiatr</w:t>
-      </w:r>
-      <w:proofErr w:type="spellEnd"/>
-      <w:r>
-        <w:rPr>
-          <w:i/>
-          <w:iCs/>
-        </w:rPr>
-        <w:t>. Serv.</w:t>
+        <w:t>Psychiatr. Serv.</w:t>
       </w:r>
       <w:r>
         <w:t xml:space="preserve"> </w:t>
@@ -15656,31 +14541,14 @@
         <w:t>et al.</w:t>
       </w:r>
       <w:r>
-        <w:t xml:space="preserve"> Management of Negative Symptoms Among Patients </w:t>
-      </w:r>
-      <w:proofErr w:type="gramStart"/>
-      <w:r>
-        <w:t>With</w:t>
-      </w:r>
-      <w:proofErr w:type="gramEnd"/>
-      <w:r>
-        <w:t xml:space="preserve"> Schizophrenia Attending Multiple-Family Groups. </w:t>
-      </w:r>
-      <w:proofErr w:type="spellStart"/>
+        <w:t xml:space="preserve"> Management of Negative Symptoms Among Patients With Schizophrenia Attending Multiple-Family Groups. </w:t>
+      </w:r>
       <w:r>
         <w:rPr>
           <w:i/>
           <w:iCs/>
         </w:rPr>
-        <w:t>Psychiatr</w:t>
-      </w:r>
-      <w:proofErr w:type="spellEnd"/>
-      <w:r>
-        <w:rPr>
-          <w:i/>
-          <w:iCs/>
-        </w:rPr>
-        <w:t>. Serv.</w:t>
+        <w:t>Psychiatr. Serv.</w:t>
       </w:r>
       <w:r>
         <w:t xml:space="preserve"> </w:t>
@@ -15711,14 +14579,7 @@
       </w:r>
       <w:r>
         <w:tab/>
-      </w:r>
-      <w:proofErr w:type="spellStart"/>
-      <w:r>
-        <w:t>McCay</w:t>
-      </w:r>
-      <w:proofErr w:type="spellEnd"/>
-      <w:r>
-        <w:t xml:space="preserve">, E. </w:t>
+        <w:t xml:space="preserve">McCay, E. </w:t>
       </w:r>
       <w:r>
         <w:rPr>
@@ -15730,37 +14591,12 @@
       <w:r>
         <w:t xml:space="preserve"> A Group Intervention to Promote Healthy Self-Concepts and Guide Recovery in First Episode Schizophrenia: A Pilot Study. </w:t>
       </w:r>
-      <w:proofErr w:type="spellStart"/>
       <w:r>
         <w:rPr>
           <w:i/>
           <w:iCs/>
         </w:rPr>
-        <w:t>Psychiatr</w:t>
-      </w:r>
-      <w:proofErr w:type="spellEnd"/>
-      <w:r>
-        <w:rPr>
-          <w:i/>
-          <w:iCs/>
-        </w:rPr>
-        <w:t xml:space="preserve">. </w:t>
-      </w:r>
-      <w:proofErr w:type="spellStart"/>
-      <w:r>
-        <w:rPr>
-          <w:i/>
-          <w:iCs/>
-        </w:rPr>
-        <w:t>Rehabil</w:t>
-      </w:r>
-      <w:proofErr w:type="spellEnd"/>
-      <w:r>
-        <w:rPr>
-          <w:i/>
-          <w:iCs/>
-        </w:rPr>
-        <w:t>. J.</w:t>
+        <w:t>Psychiatr. Rehabil. J.</w:t>
       </w:r>
       <w:r>
         <w:t xml:space="preserve"> </w:t>
@@ -15791,14 +14627,7 @@
       </w:r>
       <w:r>
         <w:tab/>
-      </w:r>
-      <w:proofErr w:type="spellStart"/>
-      <w:r>
-        <w:t>McCay</w:t>
-      </w:r>
-      <w:proofErr w:type="spellEnd"/>
-      <w:r>
-        <w:t xml:space="preserve">, E. </w:t>
+        <w:t xml:space="preserve">McCay, E. </w:t>
       </w:r>
       <w:r>
         <w:rPr>
@@ -15808,46 +14637,14 @@
         <w:t>et al.</w:t>
       </w:r>
       <w:r>
-        <w:t xml:space="preserve"> A </w:t>
-      </w:r>
-      <w:proofErr w:type="spellStart"/>
-      <w:r>
-        <w:t>randomised</w:t>
-      </w:r>
-      <w:proofErr w:type="spellEnd"/>
-      <w:r>
-        <w:t xml:space="preserve"> controlled trial of a group intervention to reduce engulfment and self-</w:t>
-      </w:r>
-      <w:proofErr w:type="spellStart"/>
-      <w:r>
-        <w:t>stigmatisation</w:t>
-      </w:r>
-      <w:proofErr w:type="spellEnd"/>
-      <w:r>
-        <w:t xml:space="preserve"> in first episode schizophrenia. </w:t>
+        <w:t xml:space="preserve"> A randomised controlled trial of a group intervention to reduce engulfment and self-stigmatisation in first episode schizophrenia. </w:t>
       </w:r>
       <w:r>
         <w:rPr>
           <w:i/>
           <w:iCs/>
         </w:rPr>
-        <w:t xml:space="preserve">Aust. E-J. Adv. </w:t>
-      </w:r>
-      <w:proofErr w:type="spellStart"/>
-      <w:r>
-        <w:rPr>
-          <w:i/>
-          <w:iCs/>
-        </w:rPr>
-        <w:t>Ment</w:t>
-      </w:r>
-      <w:proofErr w:type="spellEnd"/>
-      <w:r>
-        <w:rPr>
-          <w:i/>
-          <w:iCs/>
-        </w:rPr>
-        <w:t>. Health</w:t>
+        <w:t>Aust. E-J. Adv. Ment. Health</w:t>
       </w:r>
       <w:r>
         <w:t xml:space="preserve"> </w:t>
@@ -15878,14 +14675,7 @@
       </w:r>
       <w:r>
         <w:tab/>
-      </w:r>
-      <w:proofErr w:type="spellStart"/>
-      <w:r>
-        <w:t>Rüsch</w:t>
-      </w:r>
-      <w:proofErr w:type="spellEnd"/>
-      <w:r>
-        <w:t xml:space="preserve">, N. </w:t>
+        <w:t xml:space="preserve">Rüsch, N. </w:t>
       </w:r>
       <w:r>
         <w:rPr>
@@ -15933,14 +14723,7 @@
       </w:r>
       <w:r>
         <w:tab/>
-      </w:r>
-      <w:proofErr w:type="spellStart"/>
-      <w:r>
-        <w:t>Sajatovic</w:t>
-      </w:r>
-      <w:proofErr w:type="spellEnd"/>
-      <w:r>
-        <w:t xml:space="preserve"> M </w:t>
+        <w:t xml:space="preserve">Sajatovic M </w:t>
       </w:r>
       <w:r>
         <w:rPr>
@@ -15952,21 +14735,12 @@
       <w:r>
         <w:t xml:space="preserve"> A comparison of the life goals program and treatment as usual for individuals with bipolar disorder. </w:t>
       </w:r>
-      <w:proofErr w:type="spellStart"/>
       <w:r>
         <w:rPr>
           <w:i/>
           <w:iCs/>
         </w:rPr>
-        <w:t>Psychiatr</w:t>
-      </w:r>
-      <w:proofErr w:type="spellEnd"/>
-      <w:r>
-        <w:rPr>
-          <w:i/>
-          <w:iCs/>
-        </w:rPr>
-        <w:t>. Serv. Wash. DC</w:t>
+        <w:t>Psychiatr. Serv. Wash. DC</w:t>
       </w:r>
       <w:r>
         <w:t xml:space="preserve"> </w:t>
@@ -15997,14 +14771,7 @@
       </w:r>
       <w:r>
         <w:tab/>
-      </w:r>
-      <w:proofErr w:type="spellStart"/>
-      <w:r>
-        <w:t>Saloheimo</w:t>
-      </w:r>
-      <w:proofErr w:type="spellEnd"/>
-      <w:r>
-        <w:t xml:space="preserve">, H. P. </w:t>
+        <w:t xml:space="preserve">Saloheimo, H. P. </w:t>
       </w:r>
       <w:r>
         <w:rPr>
@@ -16062,25 +14829,8 @@
         <w:t>et al.</w:t>
       </w:r>
       <w:r>
-        <w:t xml:space="preserve"> Group art therapy as an adjunctive treatment for people with schizophrenia: </w:t>
-      </w:r>
-      <w:proofErr w:type="spellStart"/>
-      <w:r>
-        <w:t>multicentre</w:t>
-      </w:r>
-      <w:proofErr w:type="spellEnd"/>
-      <w:r>
-        <w:t xml:space="preserve"> pragmatic </w:t>
-      </w:r>
-      <w:proofErr w:type="spellStart"/>
-      <w:r>
-        <w:t>randomised</w:t>
-      </w:r>
-      <w:proofErr w:type="spellEnd"/>
-      <w:r>
-        <w:t xml:space="preserve"> trial. </w:t>
-      </w:r>
-      <w:proofErr w:type="spellStart"/>
+        <w:t xml:space="preserve"> Group art therapy as an adjunctive treatment for people with schizophrenia: multicentre pragmatic randomised trial. </w:t>
+      </w:r>
       <w:r>
         <w:rPr>
           <w:i/>
@@ -16088,7 +14838,6 @@
         </w:rPr>
         <w:t>Bmj</w:t>
       </w:r>
-      <w:proofErr w:type="spellEnd"/>
       <w:r>
         <w:t xml:space="preserve"> </w:t>
       </w:r>
@@ -16224,15 +14973,7 @@
         <w:t>et al.</w:t>
       </w:r>
       <w:r>
-        <w:t xml:space="preserve"> The Feasibility and Efficacy of Social Cognition and Interaction Training for Outpatients </w:t>
-      </w:r>
-      <w:proofErr w:type="gramStart"/>
-      <w:r>
-        <w:t>With</w:t>
-      </w:r>
-      <w:proofErr w:type="gramEnd"/>
-      <w:r>
-        <w:t xml:space="preserve"> Schizophrenia in Japan: A Multicenter Randomized Clinical Trial. </w:t>
+        <w:t xml:space="preserve"> The Feasibility and Efficacy of Social Cognition and Interaction Training for Outpatients With Schizophrenia in Japan: A Multicenter Randomized Clinical Trial. </w:t>
       </w:r>
       <w:r>
         <w:rPr>
@@ -16319,69 +15060,14 @@
       </w:r>
       <w:r>
         <w:tab/>
-      </w:r>
-      <w:proofErr w:type="spellStart"/>
-      <w:r>
-        <w:t>Wojtalik</w:t>
-      </w:r>
-      <w:proofErr w:type="spellEnd"/>
-      <w:r>
-        <w:t xml:space="preserve">, J., </w:t>
-      </w:r>
-      <w:proofErr w:type="spellStart"/>
-      <w:r>
-        <w:t>Eack</w:t>
-      </w:r>
-      <w:proofErr w:type="spellEnd"/>
-      <w:r>
-        <w:t xml:space="preserve">, S. &amp; </w:t>
-      </w:r>
-      <w:proofErr w:type="spellStart"/>
-      <w:r>
-        <w:t>Keshavan</w:t>
-      </w:r>
-      <w:proofErr w:type="spellEnd"/>
-      <w:r>
-        <w:t xml:space="preserve">, M. Confirmatory efficacy of cognitive enhancement therapy for early schizophrenia: Results from a multi-site randomized trial. </w:t>
+        <w:t xml:space="preserve">Wojtalik, J., Eack, S. &amp; Keshavan, M. Confirmatory efficacy of cognitive enhancement therapy for early schizophrenia: Results from a multi-site randomized trial. </w:t>
       </w:r>
       <w:r>
         <w:rPr>
           <w:i/>
           <w:iCs/>
         </w:rPr>
-        <w:t xml:space="preserve">2019 </w:t>
-      </w:r>
-      <w:proofErr w:type="spellStart"/>
-      <w:r>
-        <w:rPr>
-          <w:i/>
-          <w:iCs/>
-        </w:rPr>
-        <w:t>Congr</w:t>
-      </w:r>
-      <w:proofErr w:type="spellEnd"/>
-      <w:r>
-        <w:rPr>
-          <w:i/>
-          <w:iCs/>
-        </w:rPr>
-        <w:t xml:space="preserve">. </w:t>
-      </w:r>
-      <w:proofErr w:type="spellStart"/>
-      <w:r>
-        <w:rPr>
-          <w:i/>
-          <w:iCs/>
-        </w:rPr>
-        <w:t>Schizophr</w:t>
-      </w:r>
-      <w:proofErr w:type="spellEnd"/>
-      <w:r>
-        <w:rPr>
-          <w:i/>
-          <w:iCs/>
-        </w:rPr>
-        <w:t>. Int. Res. Soc. SIRS 2019 Orlando FL U. S.</w:t>
+        <w:t>2019 Congr. Schizophr. Int. Res. Soc. SIRS 2019 Orlando FL U. S.</w:t>
       </w:r>
       <w:r>
         <w:t xml:space="preserve"> </w:t>
@@ -16412,38 +15098,14 @@
       </w:r>
       <w:r>
         <w:tab/>
-      </w:r>
-      <w:proofErr w:type="spellStart"/>
-      <w:r>
-        <w:t>Rajji</w:t>
-      </w:r>
-      <w:proofErr w:type="spellEnd"/>
-      <w:r>
-        <w:t xml:space="preserve"> Tarek K, Mamo David C, Holden Jason, Granholm Eric, &amp; </w:t>
-      </w:r>
-      <w:proofErr w:type="spellStart"/>
-      <w:r>
-        <w:t>Mulsant</w:t>
-      </w:r>
-      <w:proofErr w:type="spellEnd"/>
-      <w:r>
-        <w:t xml:space="preserve"> Benoit H. Cognitive-Behavioral Social Skills Training for patients with late-life schizophrenia and the moderating effect of executive dysfunction. </w:t>
-      </w:r>
-      <w:proofErr w:type="spellStart"/>
+        <w:t xml:space="preserve">Rajji Tarek K, Mamo David C, Holden Jason, Granholm Eric, &amp; Mulsant Benoit H. Cognitive-Behavioral Social Skills Training for patients with late-life schizophrenia and the moderating effect of executive dysfunction. </w:t>
+      </w:r>
       <w:r>
         <w:rPr>
           <w:i/>
           <w:iCs/>
         </w:rPr>
-        <w:t>Schizophr</w:t>
-      </w:r>
-      <w:proofErr w:type="spellEnd"/>
-      <w:r>
-        <w:rPr>
-          <w:i/>
-          <w:iCs/>
-        </w:rPr>
-        <w:t>. Res.</w:t>
+        <w:t>Schizophr. Res.</w:t>
       </w:r>
       <w:r>
         <w:t xml:space="preserve"> </w:t>
@@ -16476,37 +15138,12 @@
         <w:tab/>
         <w:t xml:space="preserve">Daniels, L. &amp; Roll, D. Group treatment of social impairment in people with mental illness. </w:t>
       </w:r>
-      <w:proofErr w:type="spellStart"/>
       <w:r>
         <w:rPr>
           <w:i/>
           <w:iCs/>
         </w:rPr>
-        <w:t>Psychiatr</w:t>
-      </w:r>
-      <w:proofErr w:type="spellEnd"/>
-      <w:r>
-        <w:rPr>
-          <w:i/>
-          <w:iCs/>
-        </w:rPr>
-        <w:t xml:space="preserve">. </w:t>
-      </w:r>
-      <w:proofErr w:type="spellStart"/>
-      <w:r>
-        <w:rPr>
-          <w:i/>
-          <w:iCs/>
-        </w:rPr>
-        <w:t>Rehabil</w:t>
-      </w:r>
-      <w:proofErr w:type="spellEnd"/>
-      <w:r>
-        <w:rPr>
-          <w:i/>
-          <w:iCs/>
-        </w:rPr>
-        <w:t>. J.</w:t>
+        <w:t>Psychiatr. Rehabil. J.</w:t>
       </w:r>
       <w:r>
         <w:t xml:space="preserve"> </w:t>
@@ -16592,23 +15229,7 @@
           <w:i/>
           <w:iCs/>
         </w:rPr>
-        <w:t xml:space="preserve">Int. J. Group </w:t>
-      </w:r>
-      <w:proofErr w:type="spellStart"/>
-      <w:r>
-        <w:rPr>
-          <w:i/>
-          <w:iCs/>
-        </w:rPr>
-        <w:t>Psychother</w:t>
-      </w:r>
-      <w:proofErr w:type="spellEnd"/>
-      <w:r>
-        <w:rPr>
-          <w:i/>
-          <w:iCs/>
-        </w:rPr>
-        <w:t>.</w:t>
+        <w:t>Int. J. Group Psychother.</w:t>
       </w:r>
       <w:r>
         <w:t xml:space="preserve"> </w:t>
@@ -16649,38 +15270,14 @@
         <w:t>et al.</w:t>
       </w:r>
       <w:r>
-        <w:t xml:space="preserve"> Functional Adaptation Skills Training (FAST): A Pilot Psychosocial Intervention Study in Middle-Aged and Older Patients </w:t>
-      </w:r>
-      <w:proofErr w:type="gramStart"/>
-      <w:r>
-        <w:t>With</w:t>
-      </w:r>
-      <w:proofErr w:type="gramEnd"/>
-      <w:r>
-        <w:t xml:space="preserve"> Chronic Psychotic Disorders. </w:t>
+        <w:t xml:space="preserve"> Functional Adaptation Skills Training (FAST): A Pilot Psychosocial Intervention Study in Middle-Aged and Older Patients With Chronic Psychotic Disorders. </w:t>
       </w:r>
       <w:r>
         <w:rPr>
           <w:i/>
           <w:iCs/>
         </w:rPr>
-        <w:t xml:space="preserve">Am. J. </w:t>
-      </w:r>
-      <w:proofErr w:type="spellStart"/>
-      <w:r>
-        <w:rPr>
-          <w:i/>
-          <w:iCs/>
-        </w:rPr>
-        <w:t>Geriatr</w:t>
-      </w:r>
-      <w:proofErr w:type="spellEnd"/>
-      <w:r>
-        <w:rPr>
-          <w:i/>
-          <w:iCs/>
-        </w:rPr>
-        <w:t>. Psychiatry</w:t>
+        <w:t>Am. J. Geriatr. Psychiatry</w:t>
       </w:r>
       <w:r>
         <w:t xml:space="preserve"> </w:t>
@@ -16711,55 +15308,14 @@
       </w:r>
       <w:r>
         <w:tab/>
-        <w:t xml:space="preserve">Bond, G. R., </w:t>
-      </w:r>
-      <w:proofErr w:type="spellStart"/>
-      <w:r>
-        <w:t>McDonel</w:t>
-      </w:r>
-      <w:proofErr w:type="spellEnd"/>
-      <w:r>
-        <w:t xml:space="preserve">, E. C., Miller, L. D. &amp; </w:t>
-      </w:r>
-      <w:proofErr w:type="spellStart"/>
-      <w:r>
-        <w:t>Pensec</w:t>
-      </w:r>
-      <w:proofErr w:type="spellEnd"/>
-      <w:r>
-        <w:t xml:space="preserve">, M. Assertive community treatment and reference groups: An evaluation of their effectiveness for young adults with serious mental illness and substance abuse problems. </w:t>
-      </w:r>
-      <w:proofErr w:type="spellStart"/>
+        <w:t xml:space="preserve">Bond, G. R., McDonel, E. C., Miller, L. D. &amp; Pensec, M. Assertive community treatment and reference groups: An evaluation of their effectiveness for young adults with serious mental illness and substance abuse problems. </w:t>
+      </w:r>
       <w:r>
         <w:rPr>
           <w:i/>
           <w:iCs/>
         </w:rPr>
-        <w:t>Psychosoc</w:t>
-      </w:r>
-      <w:proofErr w:type="spellEnd"/>
-      <w:r>
-        <w:rPr>
-          <w:i/>
-          <w:iCs/>
-        </w:rPr>
-        <w:t xml:space="preserve">. </w:t>
-      </w:r>
-      <w:proofErr w:type="spellStart"/>
-      <w:r>
-        <w:rPr>
-          <w:i/>
-          <w:iCs/>
-        </w:rPr>
-        <w:t>Rehabil</w:t>
-      </w:r>
-      <w:proofErr w:type="spellEnd"/>
-      <w:r>
-        <w:rPr>
-          <w:i/>
-          <w:iCs/>
-        </w:rPr>
-        <w:t>. J.</w:t>
+        <w:t>Psychosoc. Rehabil. J.</w:t>
       </w:r>
       <w:r>
         <w:t xml:space="preserve"> </w:t>
@@ -16790,38 +15346,7 @@
       </w:r>
       <w:r>
         <w:tab/>
-      </w:r>
-      <w:proofErr w:type="spellStart"/>
-      <w:r>
-        <w:t>Bækkelund</w:t>
-      </w:r>
-      <w:proofErr w:type="spellEnd"/>
-      <w:r>
-        <w:t xml:space="preserve">, H., </w:t>
-      </w:r>
-      <w:proofErr w:type="spellStart"/>
-      <w:r>
-        <w:t>Ulvenes</w:t>
-      </w:r>
-      <w:proofErr w:type="spellEnd"/>
-      <w:r>
-        <w:t>, P., Boon-</w:t>
-      </w:r>
-      <w:proofErr w:type="spellStart"/>
-      <w:r>
-        <w:t>Langelaan</w:t>
-      </w:r>
-      <w:proofErr w:type="spellEnd"/>
-      <w:r>
-        <w:t xml:space="preserve">, S. &amp; </w:t>
-      </w:r>
-      <w:proofErr w:type="spellStart"/>
-      <w:r>
-        <w:t>Arnevik</w:t>
-      </w:r>
-      <w:proofErr w:type="spellEnd"/>
-      <w:r>
-        <w:t xml:space="preserve">, E. A. Group treatment for complex dissociative disorders: a randomized clinical trial. </w:t>
+        <w:t xml:space="preserve">Bækkelund, H., Ulvenes, P., Boon-Langelaan, S. &amp; Arnevik, E. A. Group treatment for complex dissociative disorders: a randomized clinical trial. </w:t>
       </w:r>
       <w:r>
         <w:rPr>
@@ -16859,61 +15384,14 @@
       </w:r>
       <w:r>
         <w:tab/>
-      </w:r>
-      <w:proofErr w:type="spellStart"/>
-      <w:r>
-        <w:t>Kallestad</w:t>
-      </w:r>
-      <w:proofErr w:type="spellEnd"/>
-      <w:r>
-        <w:t xml:space="preserve"> </w:t>
-      </w:r>
-      <w:proofErr w:type="spellStart"/>
-      <w:r>
-        <w:t>Håvard</w:t>
-      </w:r>
-      <w:proofErr w:type="spellEnd"/>
-      <w:r>
-        <w:t xml:space="preserve">, </w:t>
-      </w:r>
-      <w:proofErr w:type="spellStart"/>
-      <w:r>
-        <w:t>Wullum</w:t>
-      </w:r>
-      <w:proofErr w:type="spellEnd"/>
-      <w:r>
-        <w:t xml:space="preserve"> Elin, Scott Jan, Stiles Tore C, &amp; </w:t>
-      </w:r>
-      <w:proofErr w:type="spellStart"/>
-      <w:r>
-        <w:t>Morken</w:t>
-      </w:r>
-      <w:proofErr w:type="spellEnd"/>
-      <w:r>
-        <w:t xml:space="preserve"> Gunnar. The long-term outcomes of an effectiveness trial of group versus individual psychoeducation for bipolar disorders. </w:t>
+        <w:t xml:space="preserve">Kallestad Håvard, Wullum Elin, Scott Jan, Stiles Tore C, &amp; Morken Gunnar. The long-term outcomes of an effectiveness trial of group versus individual psychoeducation for bipolar disorders. </w:t>
       </w:r>
       <w:r>
         <w:rPr>
           <w:i/>
           <w:iCs/>
         </w:rPr>
-        <w:t xml:space="preserve">J. Affect. </w:t>
-      </w:r>
-      <w:proofErr w:type="spellStart"/>
-      <w:r>
-        <w:rPr>
-          <w:i/>
-          <w:iCs/>
-        </w:rPr>
-        <w:t>Disord</w:t>
-      </w:r>
-      <w:proofErr w:type="spellEnd"/>
-      <w:r>
-        <w:rPr>
-          <w:i/>
-          <w:iCs/>
-        </w:rPr>
-        <w:t>.</w:t>
+        <w:t>J. Affect. Disord.</w:t>
       </w:r>
       <w:r>
         <w:t xml:space="preserve"> </w:t>
@@ -16944,71 +15422,14 @@
       </w:r>
       <w:r>
         <w:tab/>
-        <w:t xml:space="preserve">Morton, J., Snowdon, S., </w:t>
-      </w:r>
-      <w:proofErr w:type="spellStart"/>
-      <w:r>
-        <w:t>Gopold</w:t>
-      </w:r>
-      <w:proofErr w:type="spellEnd"/>
-      <w:r>
-        <w:t xml:space="preserve">, M. &amp; </w:t>
-      </w:r>
-      <w:proofErr w:type="spellStart"/>
-      <w:r>
-        <w:t>Guymer</w:t>
-      </w:r>
-      <w:proofErr w:type="spellEnd"/>
-      <w:r>
-        <w:t xml:space="preserve">, E. Acceptance and commitment therapy group treatment for symptoms of borderline personality disorder: a public sector pilot study. </w:t>
-      </w:r>
-      <w:proofErr w:type="spellStart"/>
+        <w:t xml:space="preserve">Morton, J., Snowdon, S., Gopold, M. &amp; Guymer, E. Acceptance and commitment therapy group treatment for symptoms of borderline personality disorder: a public sector pilot study. </w:t>
+      </w:r>
       <w:r>
         <w:rPr>
           <w:i/>
           <w:iCs/>
         </w:rPr>
-        <w:t>Cogn</w:t>
-      </w:r>
-      <w:proofErr w:type="spellEnd"/>
-      <w:r>
-        <w:rPr>
-          <w:i/>
-          <w:iCs/>
-        </w:rPr>
-        <w:t xml:space="preserve">. </w:t>
-      </w:r>
-      <w:proofErr w:type="spellStart"/>
-      <w:r>
-        <w:rPr>
-          <w:i/>
-          <w:iCs/>
-        </w:rPr>
-        <w:t>Behav</w:t>
-      </w:r>
-      <w:proofErr w:type="spellEnd"/>
-      <w:r>
-        <w:rPr>
-          <w:i/>
-          <w:iCs/>
-        </w:rPr>
-        <w:t xml:space="preserve">. </w:t>
-      </w:r>
-      <w:proofErr w:type="spellStart"/>
-      <w:r>
-        <w:rPr>
-          <w:i/>
-          <w:iCs/>
-        </w:rPr>
-        <w:t>Pract</w:t>
-      </w:r>
-      <w:proofErr w:type="spellEnd"/>
-      <w:r>
-        <w:rPr>
-          <w:i/>
-          <w:iCs/>
-        </w:rPr>
-        <w:t>.</w:t>
+        <w:t>Cogn. Behav. Pract.</w:t>
       </w:r>
       <w:r>
         <w:t xml:space="preserve"> </w:t>
@@ -17039,39 +15460,14 @@
       </w:r>
       <w:r>
         <w:tab/>
-        <w:t xml:space="preserve">van </w:t>
-      </w:r>
-      <w:proofErr w:type="spellStart"/>
-      <w:r>
-        <w:t>Gestel</w:t>
-      </w:r>
-      <w:proofErr w:type="spellEnd"/>
-      <w:r>
-        <w:t xml:space="preserve">-Timmermans, H., Brouwers, E. P. M., van Assen, M. A. L. M. &amp; van </w:t>
-      </w:r>
-      <w:proofErr w:type="spellStart"/>
-      <w:r>
-        <w:t>Nieuwenhuizen</w:t>
-      </w:r>
-      <w:proofErr w:type="spellEnd"/>
-      <w:r>
-        <w:t xml:space="preserve">, C. Effects of a peer-run course on recovery from serious mental illness: a randomized controlled trial. </w:t>
-      </w:r>
-      <w:proofErr w:type="spellStart"/>
+        <w:t xml:space="preserve">van Gestel-Timmermans, H., Brouwers, E. P. M., van Assen, M. A. L. M. &amp; van Nieuwenhuizen, C. Effects of a peer-run course on recovery from serious mental illness: a randomized controlled trial. </w:t>
+      </w:r>
       <w:r>
         <w:rPr>
           <w:i/>
           <w:iCs/>
         </w:rPr>
-        <w:t>Psychiatr</w:t>
-      </w:r>
-      <w:proofErr w:type="spellEnd"/>
-      <w:r>
-        <w:rPr>
-          <w:i/>
-          <w:iCs/>
-        </w:rPr>
-        <w:t>. Serv.</w:t>
+        <w:t>Psychiatr. Serv.</w:t>
       </w:r>
       <w:r>
         <w:t xml:space="preserve"> </w:t>
@@ -17102,39 +15498,14 @@
       </w:r>
       <w:r>
         <w:tab/>
-        <w:t xml:space="preserve">Ball SA, Cobb-Richardson P, Connolly AJ, </w:t>
-      </w:r>
-      <w:proofErr w:type="spellStart"/>
-      <w:r>
-        <w:t>Bujosa</w:t>
-      </w:r>
-      <w:proofErr w:type="spellEnd"/>
-      <w:r>
-        <w:t xml:space="preserve"> CT, &amp; </w:t>
-      </w:r>
-      <w:proofErr w:type="spellStart"/>
-      <w:r>
-        <w:t>O’Neall</w:t>
-      </w:r>
-      <w:proofErr w:type="spellEnd"/>
-      <w:r>
-        <w:t xml:space="preserve"> TW. Substance abuse and personality disorders in homeless drop-in center clients: Symptom severity and psychotherapy retention in a randomized clinical trial. </w:t>
-      </w:r>
-      <w:proofErr w:type="spellStart"/>
+        <w:t xml:space="preserve">Ball SA, Cobb-Richardson P, Connolly AJ, Bujosa CT, &amp; O’Neall TW. Substance abuse and personality disorders in homeless drop-in center clients: Symptom severity and psychotherapy retention in a randomized clinical trial. </w:t>
+      </w:r>
       <w:r>
         <w:rPr>
           <w:i/>
           <w:iCs/>
         </w:rPr>
-        <w:t>Compr</w:t>
-      </w:r>
-      <w:proofErr w:type="spellEnd"/>
-      <w:r>
-        <w:rPr>
-          <w:i/>
-          <w:iCs/>
-        </w:rPr>
-        <w:t>. Psychiatry</w:t>
+        <w:t>Compr. Psychiatry</w:t>
       </w:r>
       <w:r>
         <w:t xml:space="preserve"> </w:t>
@@ -17165,31 +15536,7 @@
       </w:r>
       <w:r>
         <w:tab/>
-        <w:t xml:space="preserve">Morley, K. C., </w:t>
-      </w:r>
-      <w:proofErr w:type="spellStart"/>
-      <w:r>
-        <w:t>Sitharthan</w:t>
-      </w:r>
-      <w:proofErr w:type="spellEnd"/>
-      <w:r>
-        <w:t xml:space="preserve">, G., Haber, P. S., Tucker, P. &amp; </w:t>
-      </w:r>
-      <w:proofErr w:type="spellStart"/>
-      <w:r>
-        <w:t>Sitharthan</w:t>
-      </w:r>
-      <w:proofErr w:type="spellEnd"/>
-      <w:r>
-        <w:t xml:space="preserve">, T. The efficacy of an opportunistic cognitive behavioral intervention package (OCB) on substance </w:t>
-      </w:r>
-      <w:proofErr w:type="gramStart"/>
-      <w:r>
-        <w:t>use</w:t>
-      </w:r>
-      <w:proofErr w:type="gramEnd"/>
-      <w:r>
-        <w:t xml:space="preserve"> and comorbid suicide risk: A multisite randomized controlled trial. </w:t>
+        <w:t xml:space="preserve">Morley, K. C., Sitharthan, G., Haber, P. S., Tucker, P. &amp; Sitharthan, T. The efficacy of an opportunistic cognitive behavioral intervention package (OCB) on substance use and comorbid suicide risk: A multisite randomized controlled trial. </w:t>
       </w:r>
       <w:r>
         <w:rPr>
@@ -17336,21 +15683,12 @@
       <w:r>
         <w:t xml:space="preserve"> A controlled trial of supported employment for people with severe mental illness and justice involvement. </w:t>
       </w:r>
-      <w:proofErr w:type="spellStart"/>
       <w:r>
         <w:rPr>
           <w:i/>
           <w:iCs/>
         </w:rPr>
-        <w:t>Psychiatr</w:t>
-      </w:r>
-      <w:proofErr w:type="spellEnd"/>
-      <w:r>
-        <w:rPr>
-          <w:i/>
-          <w:iCs/>
-        </w:rPr>
-        <w:t>. Serv.</w:t>
+        <w:t>Psychiatr. Serv.</w:t>
       </w:r>
       <w:r>
         <w:t xml:space="preserve"> </w:t>
@@ -17381,69 +15719,14 @@
       </w:r>
       <w:r>
         <w:tab/>
-      </w:r>
-      <w:proofErr w:type="spellStart"/>
-      <w:r>
-        <w:t>Bozzer</w:t>
-      </w:r>
-      <w:proofErr w:type="spellEnd"/>
-      <w:r>
-        <w:t xml:space="preserve">, M., Samsom, D. &amp; Anson, J. An evaluation of a community-based vocational rehabilitation program for adults with psychiatric disabilities. </w:t>
+        <w:t xml:space="preserve">Bozzer, M., Samsom, D. &amp; Anson, J. An evaluation of a community-based vocational rehabilitation program for adults with psychiatric disabilities. </w:t>
       </w:r>
       <w:r>
         <w:rPr>
           <w:i/>
           <w:iCs/>
         </w:rPr>
-        <w:t xml:space="preserve">Can. J. Community </w:t>
-      </w:r>
-      <w:proofErr w:type="spellStart"/>
-      <w:r>
-        <w:rPr>
-          <w:i/>
-          <w:iCs/>
-        </w:rPr>
-        <w:t>Ment</w:t>
-      </w:r>
-      <w:proofErr w:type="spellEnd"/>
-      <w:r>
-        <w:rPr>
-          <w:i/>
-          <w:iCs/>
-        </w:rPr>
-        <w:t xml:space="preserve">. Health Rev. Can. Sante </w:t>
-      </w:r>
-      <w:proofErr w:type="spellStart"/>
-      <w:r>
-        <w:rPr>
-          <w:i/>
-          <w:iCs/>
-        </w:rPr>
-        <w:t>Ment</w:t>
-      </w:r>
-      <w:proofErr w:type="spellEnd"/>
-      <w:r>
-        <w:rPr>
-          <w:i/>
-          <w:iCs/>
-        </w:rPr>
-        <w:t xml:space="preserve">. </w:t>
-      </w:r>
-      <w:proofErr w:type="spellStart"/>
-      <w:r>
-        <w:rPr>
-          <w:i/>
-          <w:iCs/>
-        </w:rPr>
-        <w:t>Communaut</w:t>
-      </w:r>
-      <w:proofErr w:type="spellEnd"/>
-      <w:r>
-        <w:rPr>
-          <w:i/>
-          <w:iCs/>
-        </w:rPr>
-        <w:t>.</w:t>
+        <w:t>Can. J. Community Ment. Health Rev. Can. Sante Ment. Communaut.</w:t>
       </w:r>
       <w:r>
         <w:t xml:space="preserve"> </w:t>
@@ -17474,54 +15757,14 @@
       </w:r>
       <w:r>
         <w:tab/>
-      </w:r>
-      <w:proofErr w:type="spellStart"/>
-      <w:r>
-        <w:t>Russinova</w:t>
-      </w:r>
-      <w:proofErr w:type="spellEnd"/>
-      <w:r>
-        <w:t xml:space="preserve">, Z., </w:t>
-      </w:r>
-      <w:proofErr w:type="spellStart"/>
-      <w:r>
-        <w:t>Gidugu</w:t>
-      </w:r>
-      <w:proofErr w:type="spellEnd"/>
-      <w:r>
-        <w:t xml:space="preserve">, V., Bloch, P., Restrepo-Toro, M. &amp; Rogers, E. S. Empowering individuals with psychiatric disabilities to work: Results of a randomized trial. </w:t>
-      </w:r>
-      <w:proofErr w:type="spellStart"/>
+        <w:t xml:space="preserve">Russinova, Z., Gidugu, V., Bloch, P., Restrepo-Toro, M. &amp; Rogers, E. S. Empowering individuals with psychiatric disabilities to work: Results of a randomized trial. </w:t>
+      </w:r>
       <w:r>
         <w:rPr>
           <w:i/>
           <w:iCs/>
         </w:rPr>
-        <w:t>Psychiatr</w:t>
-      </w:r>
-      <w:proofErr w:type="spellEnd"/>
-      <w:r>
-        <w:rPr>
-          <w:i/>
-          <w:iCs/>
-        </w:rPr>
-        <w:t xml:space="preserve">. </w:t>
-      </w:r>
-      <w:proofErr w:type="spellStart"/>
-      <w:r>
-        <w:rPr>
-          <w:i/>
-          <w:iCs/>
-        </w:rPr>
-        <w:t>Rehabil</w:t>
-      </w:r>
-      <w:proofErr w:type="spellEnd"/>
-      <w:r>
-        <w:rPr>
-          <w:i/>
-          <w:iCs/>
-        </w:rPr>
-        <w:t>. J.</w:t>
+        <w:t>Psychiatr. Rehabil. J.</w:t>
       </w:r>
       <w:r>
         <w:t xml:space="preserve"> </w:t>
@@ -17617,17 +15860,8 @@
           <w:i/>
           <w:iCs/>
         </w:rPr>
-        <w:t xml:space="preserve">Eur. J. </w:t>
-      </w:r>
-      <w:proofErr w:type="spellStart"/>
-      <w:r>
-        <w:rPr>
-          <w:i/>
-          <w:iCs/>
-        </w:rPr>
-        <w:t>Psychotraumatology</w:t>
-      </w:r>
-      <w:proofErr w:type="spellEnd"/>
+        <w:t>Eur. J. Psychotraumatology</w:t>
+      </w:r>
       <w:r>
         <w:t xml:space="preserve"> </w:t>
       </w:r>
@@ -17669,21 +15903,12 @@
       <w:r>
         <w:t xml:space="preserve"> A randomized trial examining housing first in congregate and scattered site formats. </w:t>
       </w:r>
-      <w:proofErr w:type="spellStart"/>
       <w:r>
         <w:rPr>
           <w:i/>
           <w:iCs/>
         </w:rPr>
-        <w:t>PloS</w:t>
-      </w:r>
-      <w:proofErr w:type="spellEnd"/>
-      <w:r>
-        <w:rPr>
-          <w:i/>
-          <w:iCs/>
-        </w:rPr>
-        <w:t xml:space="preserve"> One</w:t>
+        <w:t>PloS One</w:t>
       </w:r>
       <w:r>
         <w:t xml:space="preserve"> </w:t>
@@ -17714,15 +15939,7 @@
       </w:r>
       <w:r>
         <w:tab/>
-        <w:t xml:space="preserve">Sacks, S., McKendrick, K., </w:t>
-      </w:r>
-      <w:proofErr w:type="spellStart"/>
-      <w:r>
-        <w:t>Vazan</w:t>
-      </w:r>
-      <w:proofErr w:type="spellEnd"/>
-      <w:r>
-        <w:t xml:space="preserve">, P., Sacks, J. Y. &amp; Cleland, C. M. Modified therapeutic community aftercare for clients triply diagnosed with HIV/AIDS and co-occurring mental and substance use disorders. </w:t>
+        <w:t xml:space="preserve">Sacks, S., McKendrick, K., Vazan, P., Sacks, J. Y. &amp; Cleland, C. M. Modified therapeutic community aftercare for clients triply diagnosed with HIV/AIDS and co-occurring mental and substance use disorders. </w:t>
       </w:r>
       <w:r>
         <w:rPr>
@@ -17818,39 +16035,14 @@
         <w:t>et al.</w:t>
       </w:r>
       <w:r>
-        <w:t xml:space="preserve"> The Community Navigator Study: Results from a feasibility </w:t>
-      </w:r>
-      <w:proofErr w:type="spellStart"/>
-      <w:r>
-        <w:t>randomised</w:t>
-      </w:r>
-      <w:proofErr w:type="spellEnd"/>
-      <w:r>
-        <w:t xml:space="preserve"> controlled trial of a </w:t>
-      </w:r>
-      <w:proofErr w:type="spellStart"/>
-      <w:r>
-        <w:t>programme</w:t>
-      </w:r>
-      <w:proofErr w:type="spellEnd"/>
-      <w:r>
-        <w:t xml:space="preserve"> to reduce loneliness for people with complex anxiety or depression. </w:t>
-      </w:r>
-      <w:proofErr w:type="spellStart"/>
+        <w:t xml:space="preserve"> The Community Navigator Study: Results from a feasibility randomised controlled trial of a programme to reduce loneliness for people with complex anxiety or depression. </w:t>
+      </w:r>
       <w:r>
         <w:rPr>
           <w:i/>
           <w:iCs/>
         </w:rPr>
-        <w:t>Plos</w:t>
-      </w:r>
-      <w:proofErr w:type="spellEnd"/>
-      <w:r>
-        <w:rPr>
-          <w:i/>
-          <w:iCs/>
-        </w:rPr>
-        <w:t xml:space="preserve"> One</w:t>
+        <w:t>Plos One</w:t>
       </w:r>
       <w:r>
         <w:t xml:space="preserve"> </w:t>
@@ -17881,14 +16073,7 @@
       </w:r>
       <w:r>
         <w:tab/>
-      </w:r>
-      <w:proofErr w:type="spellStart"/>
-      <w:r>
-        <w:t>Tjaden</w:t>
-      </w:r>
-      <w:proofErr w:type="spellEnd"/>
-      <w:r>
-        <w:t xml:space="preserve">, C. </w:t>
+        <w:t xml:space="preserve">Tjaden, C. </w:t>
       </w:r>
       <w:r>
         <w:rPr>
@@ -17898,15 +16083,7 @@
         <w:t>et al.</w:t>
       </w:r>
       <w:r>
-        <w:t xml:space="preserve"> Effectiveness of Resource Groups for Improving Empowerment, Quality of Life, and Functioning of People </w:t>
-      </w:r>
-      <w:proofErr w:type="gramStart"/>
-      <w:r>
-        <w:t>With</w:t>
-      </w:r>
-      <w:proofErr w:type="gramEnd"/>
-      <w:r>
-        <w:t xml:space="preserve"> Severe Mental Illness A Randomized Clinical Trial. </w:t>
+        <w:t xml:space="preserve"> Effectiveness of Resource Groups for Improving Empowerment, Quality of Life, and Functioning of People With Severe Mental Illness A Randomized Clinical Trial. </w:t>
       </w:r>
       <w:r>
         <w:rPr>
@@ -17944,14 +16121,7 @@
       </w:r>
       <w:r>
         <w:tab/>
-      </w:r>
-      <w:proofErr w:type="spellStart"/>
-      <w:r>
-        <w:t>Schrank</w:t>
-      </w:r>
-      <w:proofErr w:type="spellEnd"/>
-      <w:r>
-        <w:t xml:space="preserve">, B. </w:t>
+        <w:t xml:space="preserve">Schrank, B. </w:t>
       </w:r>
       <w:r>
         <w:rPr>
@@ -17961,38 +16131,14 @@
         <w:t>et al.</w:t>
       </w:r>
       <w:r>
-        <w:t xml:space="preserve"> Evaluation of a positive psychotherapy group intervention for people with psychosis: pilot </w:t>
-      </w:r>
-      <w:proofErr w:type="spellStart"/>
-      <w:r>
-        <w:t>randomised</w:t>
-      </w:r>
-      <w:proofErr w:type="spellEnd"/>
-      <w:r>
-        <w:t xml:space="preserve"> controlled trial. </w:t>
+        <w:t xml:space="preserve"> Evaluation of a positive psychotherapy group intervention for people with psychosis: pilot randomised controlled trial. </w:t>
       </w:r>
       <w:r>
         <w:rPr>
           <w:i/>
           <w:iCs/>
         </w:rPr>
-        <w:t xml:space="preserve">Epidemiol. </w:t>
-      </w:r>
-      <w:proofErr w:type="spellStart"/>
-      <w:r>
-        <w:rPr>
-          <w:i/>
-          <w:iCs/>
-        </w:rPr>
-        <w:t>Psychiatr</w:t>
-      </w:r>
-      <w:proofErr w:type="spellEnd"/>
-      <w:r>
-        <w:rPr>
-          <w:i/>
-          <w:iCs/>
-        </w:rPr>
-        <w:t>. Sci.</w:t>
+        <w:t>Epidemiol. Psychiatr. Sci.</w:t>
       </w:r>
       <w:r>
         <w:t xml:space="preserve"> </w:t>
@@ -18023,14 +16169,7 @@
       </w:r>
       <w:r>
         <w:tab/>
-      </w:r>
-      <w:proofErr w:type="spellStart"/>
-      <w:r>
-        <w:t>Valiente</w:t>
-      </w:r>
-      <w:proofErr w:type="spellEnd"/>
-      <w:r>
-        <w:t xml:space="preserve">, C. </w:t>
+        <w:t xml:space="preserve">Valiente, C. </w:t>
       </w:r>
       <w:r>
         <w:rPr>
@@ -18042,37 +16181,12 @@
       <w:r>
         <w:t xml:space="preserve"> A multicomponent positive psychology group intervention for people with severe psychiatric conditions; a randomized clinical trial. </w:t>
       </w:r>
-      <w:proofErr w:type="spellStart"/>
       <w:r>
         <w:rPr>
           <w:i/>
           <w:iCs/>
         </w:rPr>
-        <w:t>Psychiatr</w:t>
-      </w:r>
-      <w:proofErr w:type="spellEnd"/>
-      <w:r>
-        <w:rPr>
-          <w:i/>
-          <w:iCs/>
-        </w:rPr>
-        <w:t xml:space="preserve">. </w:t>
-      </w:r>
-      <w:proofErr w:type="spellStart"/>
-      <w:r>
-        <w:rPr>
-          <w:i/>
-          <w:iCs/>
-        </w:rPr>
-        <w:t>Rehabil</w:t>
-      </w:r>
-      <w:proofErr w:type="spellEnd"/>
-      <w:r>
-        <w:rPr>
-          <w:i/>
-          <w:iCs/>
-        </w:rPr>
-        <w:t>. J.</w:t>
+        <w:t>Psychiatr. Rehabil. J.</w:t>
       </w:r>
       <w:r>
         <w:t xml:space="preserve"> </w:t>
@@ -18103,46 +16217,14 @@
       </w:r>
       <w:r>
         <w:tab/>
-        <w:t xml:space="preserve">Volpe, U., Torre, F., De </w:t>
-      </w:r>
-      <w:proofErr w:type="spellStart"/>
-      <w:r>
-        <w:t>Santis</w:t>
-      </w:r>
-      <w:proofErr w:type="spellEnd"/>
-      <w:r>
-        <w:t xml:space="preserve">, V., Perris, F. &amp; </w:t>
-      </w:r>
-      <w:proofErr w:type="spellStart"/>
-      <w:r>
-        <w:t>Catapano</w:t>
-      </w:r>
-      <w:proofErr w:type="spellEnd"/>
-      <w:r>
-        <w:t xml:space="preserve">, F. Reading group rehabilitation for patients with psychosis: A randomized controlled study. </w:t>
+        <w:t xml:space="preserve">Volpe, U., Torre, F., De Santis, V., Perris, F. &amp; Catapano, F. Reading group rehabilitation for patients with psychosis: A randomized controlled study. </w:t>
       </w:r>
       <w:r>
         <w:rPr>
           <w:i/>
           <w:iCs/>
         </w:rPr>
-        <w:t xml:space="preserve">Clin. Psychol. </w:t>
-      </w:r>
-      <w:proofErr w:type="spellStart"/>
-      <w:r>
-        <w:rPr>
-          <w:i/>
-          <w:iCs/>
-        </w:rPr>
-        <w:t>Psychother</w:t>
-      </w:r>
-      <w:proofErr w:type="spellEnd"/>
-      <w:r>
-        <w:rPr>
-          <w:i/>
-          <w:iCs/>
-        </w:rPr>
-        <w:t>.</w:t>
+        <w:t>Clin. Psychol. Psychother.</w:t>
       </w:r>
       <w:r>
         <w:t xml:space="preserve"> </w:t>
@@ -18183,23 +16265,7 @@
         <w:t>et al.</w:t>
       </w:r>
       <w:r>
-        <w:t xml:space="preserve"> </w:t>
-      </w:r>
-      <w:proofErr w:type="spellStart"/>
-      <w:r>
-        <w:t>RoB</w:t>
-      </w:r>
-      <w:proofErr w:type="spellEnd"/>
-      <w:r>
-        <w:t xml:space="preserve"> 2: A revised tool for assessing risk of bias in </w:t>
-      </w:r>
-      <w:proofErr w:type="spellStart"/>
-      <w:r>
-        <w:t>randomised</w:t>
-      </w:r>
-      <w:proofErr w:type="spellEnd"/>
-      <w:r>
-        <w:t xml:space="preserve"> trials. </w:t>
+        <w:t xml:space="preserve"> RoB 2: A revised tool for assessing risk of bias in randomised trials. </w:t>
       </w:r>
       <w:r>
         <w:rPr>
@@ -18247,15 +16313,7 @@
         <w:t>et al.</w:t>
       </w:r>
       <w:r>
-        <w:t xml:space="preserve"> ROBINS-I: A tool for assessing risk of bias in non-</w:t>
-      </w:r>
-      <w:proofErr w:type="spellStart"/>
-      <w:r>
-        <w:t>randomised</w:t>
-      </w:r>
-      <w:proofErr w:type="spellEnd"/>
-      <w:r>
-        <w:t xml:space="preserve"> studies of interventions. </w:t>
+        <w:t xml:space="preserve"> ROBINS-I: A tool for assessing risk of bias in non-randomised studies of interventions. </w:t>
       </w:r>
       <w:r>
         <w:rPr>
@@ -18293,38 +16351,14 @@
       </w:r>
       <w:r>
         <w:tab/>
-        <w:t xml:space="preserve">Carter, E. C., </w:t>
-      </w:r>
-      <w:proofErr w:type="spellStart"/>
-      <w:r>
-        <w:t>Schönbrodt</w:t>
-      </w:r>
-      <w:proofErr w:type="spellEnd"/>
-      <w:r>
-        <w:t xml:space="preserve">, F. D., Gervais, W. M. &amp; Hilgard, J. Correcting for bias in psychology: A comparison of meta-analytic methods. </w:t>
+        <w:t xml:space="preserve">Carter, E. C., Schönbrodt, F. D., Gervais, W. M. &amp; Hilgard, J. Correcting for bias in psychology: A comparison of meta-analytic methods. </w:t>
       </w:r>
       <w:r>
         <w:rPr>
           <w:i/>
           <w:iCs/>
         </w:rPr>
-        <w:t xml:space="preserve">Adv. Methods </w:t>
-      </w:r>
-      <w:proofErr w:type="spellStart"/>
-      <w:r>
-        <w:rPr>
-          <w:i/>
-          <w:iCs/>
-        </w:rPr>
-        <w:t>Pract</w:t>
-      </w:r>
-      <w:proofErr w:type="spellEnd"/>
-      <w:r>
-        <w:rPr>
-          <w:i/>
-          <w:iCs/>
-        </w:rPr>
-        <w:t>. Psychol. Sci.</w:t>
+        <w:t>Adv. Methods Pract. Psychol. Sci.</w:t>
       </w:r>
       <w:r>
         <w:t xml:space="preserve"> </w:t>
@@ -18384,49 +16418,17 @@
       </w:r>
       <w:r>
         <w:tab/>
-        <w:t xml:space="preserve">Hedges, L. V. &amp; </w:t>
-      </w:r>
-      <w:proofErr w:type="spellStart"/>
-      <w:r>
-        <w:t>Vevea</w:t>
-      </w:r>
-      <w:proofErr w:type="spellEnd"/>
-      <w:r>
-        <w:t xml:space="preserve">, J. Selection method approaches. in </w:t>
+        <w:t xml:space="preserve">Hedges, L. V. &amp; Vevea, J. Selection method approaches. in </w:t>
       </w:r>
       <w:r>
         <w:rPr>
           <w:i/>
           <w:iCs/>
         </w:rPr>
-        <w:t xml:space="preserve">H. R. Rothstein, A. J. Sutton, &amp; M. </w:t>
-      </w:r>
-      <w:proofErr w:type="spellStart"/>
-      <w:r>
-        <w:rPr>
-          <w:i/>
-          <w:iCs/>
-        </w:rPr>
-        <w:t>Borenstein</w:t>
-      </w:r>
-      <w:proofErr w:type="spellEnd"/>
-      <w:r>
-        <w:rPr>
-          <w:i/>
-          <w:iCs/>
-        </w:rPr>
-        <w:t xml:space="preserve"> (Eds.), Publication bias in meta-analysis: Prevention, assessment and adjustments (pp. 145–174). Wiley Online Library</w:t>
-      </w:r>
-      <w:r>
-        <w:t xml:space="preserve"> (2005). </w:t>
-      </w:r>
-      <w:proofErr w:type="gramStart"/>
-      <w:r>
-        <w:t>doi:10.1002/0470870168.ch9</w:t>
-      </w:r>
-      <w:proofErr w:type="gramEnd"/>
-      <w:r>
-        <w:t>.</w:t>
+        <w:t>H. R. Rothstein, A. J. Sutton, &amp; M. Borenstein (Eds.), Publication bias in meta-analysis: Prevention, assessment and adjustments (pp. 145–174). Wiley Online Library</w:t>
+      </w:r>
+      <w:r>
+        <w:t xml:space="preserve"> (2005). doi:10.1002/0470870168.ch9.</w:t>
       </w:r>
     </w:p>
     <w:p>
@@ -18444,31 +16446,14 @@
       </w:r>
       <w:r>
         <w:tab/>
-        <w:t xml:space="preserve">McShane, B. B., </w:t>
-      </w:r>
-      <w:proofErr w:type="spellStart"/>
-      <w:r>
-        <w:t>Böckenholt</w:t>
-      </w:r>
-      <w:proofErr w:type="spellEnd"/>
-      <w:r>
-        <w:t xml:space="preserve">, U. &amp; Hansen, K. T. Adjusting for publication bias in meta-analysis: An evaluation of selection methods and some cautionary notes. </w:t>
-      </w:r>
-      <w:proofErr w:type="spellStart"/>
+        <w:t xml:space="preserve">McShane, B. B., Böckenholt, U. &amp; Hansen, K. T. Adjusting for publication bias in meta-analysis: An evaluation of selection methods and some cautionary notes. </w:t>
+      </w:r>
       <w:r>
         <w:rPr>
           <w:i/>
           <w:iCs/>
         </w:rPr>
-        <w:t>Perspect</w:t>
-      </w:r>
-      <w:proofErr w:type="spellEnd"/>
-      <w:r>
-        <w:rPr>
-          <w:i/>
-          <w:iCs/>
-        </w:rPr>
-        <w:t>. Psychol. Sci.</w:t>
+        <w:t>Perspect. Psychol. Sci.</w:t>
       </w:r>
       <w:r>
         <w:t xml:space="preserve"> </w:t>
@@ -18499,23 +16484,7 @@
       </w:r>
       <w:r>
         <w:tab/>
-        <w:t xml:space="preserve">van </w:t>
-      </w:r>
-      <w:proofErr w:type="spellStart"/>
-      <w:r>
-        <w:t>Aert</w:t>
-      </w:r>
-      <w:proofErr w:type="spellEnd"/>
-      <w:r>
-        <w:t xml:space="preserve">, R. C. M. Meta-analyzing </w:t>
-      </w:r>
-      <w:proofErr w:type="spellStart"/>
-      <w:r>
-        <w:t>nonpreregistered</w:t>
-      </w:r>
-      <w:proofErr w:type="spellEnd"/>
-      <w:r>
-        <w:t xml:space="preserve"> and preregistered studies. </w:t>
+        <w:t xml:space="preserve">van Aert, R. C. M. Meta-analyzing nonpreregistered and preregistered studies. </w:t>
       </w:r>
       <w:r>
         <w:rPr>
@@ -18543,14 +16512,7 @@
       </w:r>
       <w:r>
         <w:tab/>
-      </w:r>
-      <w:proofErr w:type="spellStart"/>
-      <w:r>
-        <w:t>Polanin</w:t>
-      </w:r>
-      <w:proofErr w:type="spellEnd"/>
-      <w:r>
-        <w:t>, J. R. Addressing the issue of meta-analysis multiplicity in education and psychology. https://ecommons.luc.edu/luc_diss/539/ (2013).</w:t>
+        <w:t>Polanin, J. R. Addressing the issue of meta-analysis multiplicity in education and psychology. https://ecommons.luc.edu/luc_diss/539/ (2013).</w:t>
       </w:r>
     </w:p>
     <w:p>
@@ -18574,20 +16536,7 @@
           <w:lang w:val="da-DK"/>
         </w:rPr>
         <w:tab/>
-      </w:r>
-      <w:proofErr w:type="spellStart"/>
-      <w:r>
-        <w:rPr>
-          <w:lang w:val="da-DK"/>
-        </w:rPr>
-        <w:t>Laird</w:t>
-      </w:r>
-      <w:proofErr w:type="spellEnd"/>
-      <w:r>
-        <w:rPr>
-          <w:lang w:val="da-DK"/>
-        </w:rPr>
-        <w:t xml:space="preserve">, A. R. </w:t>
+        <w:t xml:space="preserve">Laird, A. R. </w:t>
       </w:r>
       <w:r>
         <w:rPr>
@@ -18645,14 +16594,7 @@
       </w:r>
       <w:r>
         <w:tab/>
-      </w:r>
-      <w:proofErr w:type="spellStart"/>
-      <w:r>
-        <w:t>Benjamini</w:t>
-      </w:r>
-      <w:proofErr w:type="spellEnd"/>
-      <w:r>
-        <w:t xml:space="preserve">, Y. &amp; Hochberg, Y. Controlling the false discovery rate: A practical and powerful approach to multiple testing. </w:t>
+        <w:t xml:space="preserve">Benjamini, Y. &amp; Hochberg, Y. Controlling the false discovery rate: A practical and powerful approach to multiple testing. </w:t>
       </w:r>
       <w:r>
         <w:rPr>
@@ -18660,25 +16602,7 @@
           <w:iCs/>
           <w:lang w:val="da-DK"/>
         </w:rPr>
-        <w:t xml:space="preserve">J. R. Stat. Soc. Ser. B </w:t>
-      </w:r>
-      <w:proofErr w:type="spellStart"/>
-      <w:r>
-        <w:rPr>
-          <w:i/>
-          <w:iCs/>
-          <w:lang w:val="da-DK"/>
-        </w:rPr>
-        <w:t>Methodol</w:t>
-      </w:r>
-      <w:proofErr w:type="spellEnd"/>
-      <w:r>
-        <w:rPr>
-          <w:i/>
-          <w:iCs/>
-          <w:lang w:val="da-DK"/>
-        </w:rPr>
-        <w:t>.</w:t>
+        <w:t>J. R. Stat. Soc. Ser. B Methodol.</w:t>
       </w:r>
       <w:r>
         <w:rPr>
@@ -18722,20 +16646,7 @@
           <w:lang w:val="da-DK"/>
         </w:rPr>
         <w:tab/>
-      </w:r>
-      <w:proofErr w:type="spellStart"/>
-      <w:r>
-        <w:rPr>
-          <w:lang w:val="da-DK"/>
-        </w:rPr>
-        <w:t>Burlingame</w:t>
-      </w:r>
-      <w:proofErr w:type="spellEnd"/>
-      <w:r>
-        <w:rPr>
-          <w:lang w:val="da-DK"/>
-        </w:rPr>
-        <w:t xml:space="preserve">, G. M. </w:t>
+        <w:t xml:space="preserve">Burlingame, G. M. </w:t>
       </w:r>
       <w:r>
         <w:rPr>
@@ -18790,22 +16701,7 @@
       </w:r>
       <w:r>
         <w:tab/>
-      </w:r>
-      <w:proofErr w:type="spellStart"/>
-      <w:r>
-        <w:t>Cuijpers</w:t>
-      </w:r>
-      <w:proofErr w:type="spellEnd"/>
-      <w:r>
-        <w:t xml:space="preserve">, P., Noma, H., </w:t>
-      </w:r>
-      <w:proofErr w:type="spellStart"/>
-      <w:r>
-        <w:t>Karyotaki</w:t>
-      </w:r>
-      <w:proofErr w:type="spellEnd"/>
-      <w:r>
-        <w:t xml:space="preserve">, E., Cipriani, A. &amp; Furukawa, T. A. Effectiveness and acceptability of cognitive behavior therapy delivery formats in adults with depression: A network meta-analysis. </w:t>
+        <w:t xml:space="preserve">Cuijpers, P., Noma, H., Karyotaki, E., Cipriani, A. &amp; Furukawa, T. A. Effectiveness and acceptability of cognitive behavior therapy delivery formats in adults with depression: A network meta-analysis. </w:t>
       </w:r>
       <w:r>
         <w:rPr>
@@ -18891,46 +16787,14 @@
       </w:r>
       <w:r>
         <w:tab/>
-      </w:r>
-      <w:proofErr w:type="spellStart"/>
-      <w:r>
-        <w:t>Schwartze</w:t>
-      </w:r>
-      <w:proofErr w:type="spellEnd"/>
-      <w:r>
-        <w:t xml:space="preserve">, D., </w:t>
-      </w:r>
-      <w:proofErr w:type="spellStart"/>
-      <w:r>
-        <w:t>Barkowski</w:t>
-      </w:r>
-      <w:proofErr w:type="spellEnd"/>
-      <w:r>
-        <w:t xml:space="preserve">, S., Strauss, B., </w:t>
-      </w:r>
-      <w:proofErr w:type="spellStart"/>
-      <w:r>
-        <w:t>Knaevelsrud</w:t>
-      </w:r>
-      <w:proofErr w:type="spellEnd"/>
-      <w:r>
-        <w:t xml:space="preserve">, C. &amp; Rosendahl, J. Efficacy of group psychotherapy for posttraumatic stress disorder: Systematic review and meta-analysis of randomized controlled trials. </w:t>
-      </w:r>
-      <w:proofErr w:type="spellStart"/>
+        <w:t xml:space="preserve">Schwartze, D., Barkowski, S., Strauss, B., Knaevelsrud, C. &amp; Rosendahl, J. Efficacy of group psychotherapy for posttraumatic stress disorder: Systematic review and meta-analysis of randomized controlled trials. </w:t>
+      </w:r>
       <w:r>
         <w:rPr>
           <w:i/>
           <w:iCs/>
         </w:rPr>
-        <w:t>Psychother</w:t>
-      </w:r>
-      <w:proofErr w:type="spellEnd"/>
-      <w:r>
-        <w:rPr>
-          <w:i/>
-          <w:iCs/>
-        </w:rPr>
-        <w:t>. Res.</w:t>
+        <w:t>Psychother. Res.</w:t>
       </w:r>
       <w:r>
         <w:t xml:space="preserve"> </w:t>
@@ -18999,14 +16863,7 @@
       </w:r>
       <w:r>
         <w:tab/>
-      </w:r>
-      <w:proofErr w:type="spellStart"/>
-      <w:r>
-        <w:t>Shadish</w:t>
-      </w:r>
-      <w:proofErr w:type="spellEnd"/>
-      <w:r>
-        <w:t xml:space="preserve">, W. R., Cook, T. D. &amp; Campbell, D. T. </w:t>
+        <w:t xml:space="preserve">Shadish, W. R., Cook, T. D. &amp; Campbell, D. T. </w:t>
       </w:r>
       <w:r>
         <w:rPr>
@@ -19034,23 +16891,7 @@
       </w:r>
       <w:r>
         <w:tab/>
-        <w:t xml:space="preserve">Vembye, M. H., Christensen, J., </w:t>
-      </w:r>
-      <w:proofErr w:type="spellStart"/>
-      <w:r>
-        <w:t>Mølgaard</w:t>
-      </w:r>
-      <w:proofErr w:type="spellEnd"/>
-      <w:r>
-        <w:t xml:space="preserve">, A. B. &amp; </w:t>
-      </w:r>
-      <w:proofErr w:type="spellStart"/>
-      <w:r>
-        <w:t>Schytt</w:t>
-      </w:r>
-      <w:proofErr w:type="spellEnd"/>
-      <w:r>
-        <w:t xml:space="preserve">, F. L. W. Generative pretrained transformer models can function as highly reliable second screeners of titles and abstracts in systematic reviews: A proof of concept and common guidelines. </w:t>
+        <w:t xml:space="preserve">Vembye, M. H., Christensen, J., Mølgaard, A. B. &amp; Schytt, F. L. W. Generative pretrained transformer models can function as highly reliable second screeners of titles and abstracts in systematic reviews: A proof of concept and common guidelines. </w:t>
       </w:r>
       <w:r>
         <w:rPr>
@@ -19078,38 +16919,14 @@
       </w:r>
       <w:r>
         <w:tab/>
-      </w:r>
-      <w:proofErr w:type="spellStart"/>
-      <w:r>
-        <w:t>Hofner</w:t>
-      </w:r>
-      <w:proofErr w:type="spellEnd"/>
-      <w:r>
-        <w:t xml:space="preserve">, B., Schmid, M. &amp; </w:t>
-      </w:r>
-      <w:proofErr w:type="spellStart"/>
-      <w:r>
-        <w:t>Edler</w:t>
-      </w:r>
-      <w:proofErr w:type="spellEnd"/>
-      <w:r>
-        <w:t xml:space="preserve">, L. Reproducible research in statistics: A review and guidelines for the Biometrical Journal. </w:t>
-      </w:r>
-      <w:proofErr w:type="spellStart"/>
+        <w:t xml:space="preserve">Hofner, B., Schmid, M. &amp; Edler, L. Reproducible research in statistics: A review and guidelines for the Biometrical Journal. </w:t>
+      </w:r>
       <w:r>
         <w:rPr>
           <w:i/>
           <w:iCs/>
         </w:rPr>
-        <w:t>Biom</w:t>
-      </w:r>
-      <w:proofErr w:type="spellEnd"/>
-      <w:r>
-        <w:rPr>
-          <w:i/>
-          <w:iCs/>
-        </w:rPr>
-        <w:t>. J.</w:t>
+        <w:t>Biom. J.</w:t>
       </w:r>
       <w:r>
         <w:t xml:space="preserve"> </w:t>
@@ -19232,30 +17049,14 @@
       </w:r>
       <w:r>
         <w:tab/>
-      </w:r>
-      <w:proofErr w:type="spellStart"/>
-      <w:r>
-        <w:t>Borenstein</w:t>
-      </w:r>
-      <w:proofErr w:type="spellEnd"/>
-      <w:r>
-        <w:t xml:space="preserve">, M. &amp; Hedges, L. V. Effect sizes for meta-analysis. in </w:t>
-      </w:r>
-      <w:proofErr w:type="gramStart"/>
+        <w:t xml:space="preserve">Borenstein, M. &amp; Hedges, L. V. Effect sizes for meta-analysis. in </w:t>
+      </w:r>
       <w:r>
         <w:rPr>
           <w:i/>
           <w:iCs/>
         </w:rPr>
-        <w:t>The</w:t>
-      </w:r>
-      <w:proofErr w:type="gramEnd"/>
-      <w:r>
-        <w:rPr>
-          <w:i/>
-          <w:iCs/>
-        </w:rPr>
-        <w:t xml:space="preserve"> handbook of research synthesis and meta-analysis</w:t>
+        <w:t>The handbook of research synthesis and meta-analysis</w:t>
       </w:r>
       <w:r>
         <w:t xml:space="preserve"> (eds Cooper, H., Hedges, L. V. &amp; Valentine, J. C.) 207–242 (Russell Sage Foundation West Sussex, 2019).</w:t>
@@ -19277,15 +17078,7 @@
       </w:r>
       <w:r>
         <w:tab/>
-        <w:t xml:space="preserve">Hedges, L. V., Tipton, E., </w:t>
-      </w:r>
-      <w:proofErr w:type="spellStart"/>
-      <w:r>
-        <w:t>Zejnullahi</w:t>
-      </w:r>
-      <w:proofErr w:type="spellEnd"/>
-      <w:r>
-        <w:t xml:space="preserve">, R. &amp; Diaz, K. G. Effect sizes in ANCOVA and difference-in-differences designs. </w:t>
+        <w:t xml:space="preserve">Hedges, L. V., Tipton, E., Zejnullahi, R. &amp; Diaz, K. G. Effect sizes in ANCOVA and difference-in-differences designs. </w:t>
       </w:r>
       <w:r>
         <w:rPr>
@@ -19368,23 +17161,7 @@
           <w:i/>
           <w:iCs/>
         </w:rPr>
-        <w:t xml:space="preserve">J. Educ. </w:t>
-      </w:r>
-      <w:proofErr w:type="spellStart"/>
-      <w:r>
-        <w:rPr>
-          <w:i/>
-          <w:iCs/>
-        </w:rPr>
-        <w:t>Behav</w:t>
-      </w:r>
-      <w:proofErr w:type="spellEnd"/>
-      <w:r>
-        <w:rPr>
-          <w:i/>
-          <w:iCs/>
-        </w:rPr>
-        <w:t>. Stat.</w:t>
+        <w:t>J. Educ. Behav. Stat.</w:t>
       </w:r>
       <w:r>
         <w:t xml:space="preserve"> </w:t>
@@ -19415,31 +17192,14 @@
       </w:r>
       <w:r>
         <w:tab/>
-        <w:t xml:space="preserve">Hedges, L. V. &amp; </w:t>
-      </w:r>
-      <w:proofErr w:type="spellStart"/>
-      <w:r>
-        <w:t>Citkowicz</w:t>
-      </w:r>
-      <w:proofErr w:type="spellEnd"/>
-      <w:r>
-        <w:t xml:space="preserve">, M. Estimating effect size when there is clustering in one treatment group. </w:t>
-      </w:r>
-      <w:proofErr w:type="spellStart"/>
+        <w:t xml:space="preserve">Hedges, L. V. &amp; Citkowicz, M. Estimating effect size when there is clustering in one treatment group. </w:t>
+      </w:r>
       <w:r>
         <w:rPr>
           <w:i/>
           <w:iCs/>
         </w:rPr>
-        <w:t>Behav</w:t>
-      </w:r>
-      <w:proofErr w:type="spellEnd"/>
-      <w:r>
-        <w:rPr>
-          <w:i/>
-          <w:iCs/>
-        </w:rPr>
-        <w:t>. Res. Methods</w:t>
+        <w:t>Behav. Res. Methods</w:t>
       </w:r>
       <w:r>
         <w:t xml:space="preserve"> </w:t>
@@ -19498,15 +17258,7 @@
       </w:r>
       <w:r>
         <w:tab/>
-        <w:t xml:space="preserve">Weiss, M. J., Lockwood, J. R. &amp; McCaffrey, D. F. Estimating the Standard Error of the Impact Estimator in Individually Randomized Trials </w:t>
-      </w:r>
-      <w:proofErr w:type="gramStart"/>
-      <w:r>
-        <w:t>With</w:t>
-      </w:r>
-      <w:proofErr w:type="gramEnd"/>
-      <w:r>
-        <w:t xml:space="preserve"> Clustering. </w:t>
+        <w:t xml:space="preserve">Weiss, M. J., Lockwood, J. R. &amp; McCaffrey, D. F. Estimating the Standard Error of the Impact Estimator in Individually Randomized Trials With Clustering. </w:t>
       </w:r>
       <w:r>
         <w:rPr>
@@ -19627,23 +17379,7 @@
           <w:i/>
           <w:iCs/>
         </w:rPr>
-        <w:t xml:space="preserve">J. Educ. </w:t>
-      </w:r>
-      <w:proofErr w:type="spellStart"/>
-      <w:r>
-        <w:rPr>
-          <w:i/>
-          <w:iCs/>
-        </w:rPr>
-        <w:t>Behav</w:t>
-      </w:r>
-      <w:proofErr w:type="spellEnd"/>
-      <w:r>
-        <w:rPr>
-          <w:i/>
-          <w:iCs/>
-        </w:rPr>
-        <w:t>. Stat.</w:t>
+        <w:t>J. Educ. Behav. Stat.</w:t>
       </w:r>
       <w:r>
         <w:t xml:space="preserve"> </w:t>
@@ -19730,15 +17466,7 @@
       </w:r>
       <w:r>
         <w:tab/>
-        <w:t xml:space="preserve">Mathur, M. B. &amp; </w:t>
-      </w:r>
-      <w:proofErr w:type="spellStart"/>
-      <w:r>
-        <w:t>VanderWeele</w:t>
-      </w:r>
-      <w:proofErr w:type="spellEnd"/>
-      <w:r>
-        <w:t xml:space="preserve">, T. J. Sensitivity analysis for publication bias in meta‐analyses. </w:t>
+        <w:t xml:space="preserve">Mathur, M. B. &amp; VanderWeele, T. J. Sensitivity analysis for publication bias in meta‐analyses. </w:t>
       </w:r>
       <w:r>
         <w:rPr>
@@ -19776,31 +17504,14 @@
       </w:r>
       <w:r>
         <w:tab/>
-        <w:t xml:space="preserve">van </w:t>
-      </w:r>
-      <w:proofErr w:type="spellStart"/>
-      <w:r>
-        <w:t>Aert</w:t>
-      </w:r>
-      <w:proofErr w:type="spellEnd"/>
-      <w:r>
-        <w:t xml:space="preserve">, R. C. M. &amp; van Assen, M. A. L. M. Correcting for publication bias in a meta-analysis with the p-uniform* method. </w:t>
-      </w:r>
-      <w:proofErr w:type="spellStart"/>
+        <w:t xml:space="preserve">van Aert, R. C. M. &amp; van Assen, M. A. L. M. Correcting for publication bias in a meta-analysis with the p-uniform* method. </w:t>
+      </w:r>
       <w:r>
         <w:rPr>
           <w:i/>
           <w:iCs/>
         </w:rPr>
-        <w:t>Psychon</w:t>
-      </w:r>
-      <w:proofErr w:type="spellEnd"/>
-      <w:r>
-        <w:rPr>
-          <w:i/>
-          <w:iCs/>
-        </w:rPr>
-        <w:t>. Bull. Rev.</w:t>
+        <w:t>Psychon. Bull. Rev.</w:t>
       </w:r>
       <w:r>
         <w:t xml:space="preserve"> </w:t>
@@ -19831,15 +17542,7 @@
       </w:r>
       <w:r>
         <w:tab/>
-        <w:t xml:space="preserve">Pustejovsky, J. E., </w:t>
-      </w:r>
-      <w:proofErr w:type="spellStart"/>
-      <w:r>
-        <w:t>Citkowicz</w:t>
-      </w:r>
-      <w:proofErr w:type="spellEnd"/>
-      <w:r>
-        <w:t>, M. &amp; Joshi, M. Estimation and inference for step-function selection models in meta-analysis with dependent effects. (2025) doi:10.31222/osf.io/qg5x6_v1.</w:t>
+        <w:t>Pustejovsky, J. E., Citkowicz, M. &amp; Joshi, M. Estimation and inference for step-function selection models in meta-analysis with dependent effects. (2025) doi:10.31222/osf.io/qg5x6_v1.</w:t>
       </w:r>
     </w:p>
     <w:p>
@@ -19933,15 +17636,7 @@
       </w:r>
       <w:r>
         <w:tab/>
-        <w:t xml:space="preserve">Joshi, M., Pustejovsky, J. E. &amp; </w:t>
-      </w:r>
-      <w:proofErr w:type="spellStart"/>
-      <w:r>
-        <w:t>Beretvas</w:t>
-      </w:r>
-      <w:proofErr w:type="spellEnd"/>
-      <w:r>
-        <w:t xml:space="preserve">, S. N. Cluster wild bootstrapping to handle dependent effect sizes in meta-analysis with a small number of studies. </w:t>
+        <w:t xml:space="preserve">Joshi, M., Pustejovsky, J. E. &amp; Beretvas, S. N. Cluster wild bootstrapping to handle dependent effect sizes in meta-analysis with a small number of studies. </w:t>
       </w:r>
       <w:r>
         <w:rPr>
@@ -19989,38 +17684,14 @@
         <w:t>et al.</w:t>
       </w:r>
       <w:r>
-        <w:t xml:space="preserve"> Welcome to the </w:t>
-      </w:r>
-      <w:proofErr w:type="spellStart"/>
-      <w:r>
-        <w:t>Tidyverse</w:t>
-      </w:r>
-      <w:proofErr w:type="spellEnd"/>
-      <w:r>
-        <w:t xml:space="preserve">. </w:t>
+        <w:t xml:space="preserve"> Welcome to the Tidyverse. </w:t>
       </w:r>
       <w:r>
         <w:rPr>
           <w:i/>
           <w:iCs/>
         </w:rPr>
-        <w:t xml:space="preserve">J. Open Source </w:t>
-      </w:r>
-      <w:proofErr w:type="spellStart"/>
-      <w:r>
-        <w:rPr>
-          <w:i/>
-          <w:iCs/>
-        </w:rPr>
-        <w:t>Softw</w:t>
-      </w:r>
-      <w:proofErr w:type="spellEnd"/>
-      <w:r>
-        <w:rPr>
-          <w:i/>
-          <w:iCs/>
-        </w:rPr>
-        <w:t>.</w:t>
+        <w:t>J. Open Source Softw.</w:t>
       </w:r>
       <w:r>
         <w:t xml:space="preserve"> </w:t>
@@ -20051,38 +17722,14 @@
       </w:r>
       <w:r>
         <w:tab/>
-        <w:t xml:space="preserve">McGrath, S., Zhao, X., Steele, R. &amp; Benedetti, A. </w:t>
-      </w:r>
-      <w:proofErr w:type="spellStart"/>
-      <w:r>
-        <w:t>estmeansd</w:t>
-      </w:r>
-      <w:proofErr w:type="spellEnd"/>
-      <w:r>
-        <w:t xml:space="preserve">: Estimating the sample mean and standard deviation from commonly reported quantiles in meta-analysis. </w:t>
+        <w:t xml:space="preserve">McGrath, S., Zhao, X., Steele, R. &amp; Benedetti, A. estmeansd: Estimating the sample mean and standard deviation from commonly reported quantiles in meta-analysis. </w:t>
       </w:r>
       <w:r>
         <w:rPr>
           <w:i/>
           <w:iCs/>
         </w:rPr>
-        <w:t xml:space="preserve">CRAN Contrib. </w:t>
-      </w:r>
-      <w:proofErr w:type="spellStart"/>
-      <w:r>
-        <w:rPr>
-          <w:i/>
-          <w:iCs/>
-        </w:rPr>
-        <w:t>Packag</w:t>
-      </w:r>
-      <w:proofErr w:type="spellEnd"/>
-      <w:r>
-        <w:rPr>
-          <w:i/>
-          <w:iCs/>
-        </w:rPr>
-        <w:t>.</w:t>
+        <w:t>CRAN Contrib. Packag.</w:t>
       </w:r>
       <w:r>
         <w:t xml:space="preserve"> (2019).</w:t>
@@ -20104,45 +17751,14 @@
       </w:r>
       <w:r>
         <w:tab/>
-      </w:r>
-      <w:proofErr w:type="spellStart"/>
-      <w:r>
-        <w:t>Viechtbauer</w:t>
-      </w:r>
-      <w:proofErr w:type="spellEnd"/>
-      <w:r>
-        <w:t xml:space="preserve">, W. Conducting meta-analyses in R with the </w:t>
-      </w:r>
-      <w:proofErr w:type="spellStart"/>
-      <w:r>
-        <w:t>metafor</w:t>
-      </w:r>
-      <w:proofErr w:type="spellEnd"/>
-      <w:r>
-        <w:t xml:space="preserve"> package. </w:t>
+        <w:t xml:space="preserve">Viechtbauer, W. Conducting meta-analyses in R with the metafor package. </w:t>
       </w:r>
       <w:r>
         <w:rPr>
           <w:i/>
           <w:iCs/>
         </w:rPr>
-        <w:t xml:space="preserve">J. Stat. </w:t>
-      </w:r>
-      <w:proofErr w:type="spellStart"/>
-      <w:r>
-        <w:rPr>
-          <w:i/>
-          <w:iCs/>
-        </w:rPr>
-        <w:t>Softw</w:t>
-      </w:r>
-      <w:proofErr w:type="spellEnd"/>
-      <w:r>
-        <w:rPr>
-          <w:i/>
-          <w:iCs/>
-        </w:rPr>
-        <w:t>.</w:t>
+        <w:t>J. Stat. Softw.</w:t>
       </w:r>
       <w:r>
         <w:t xml:space="preserve"> </w:t>
@@ -20173,15 +17789,7 @@
       </w:r>
       <w:r>
         <w:tab/>
-        <w:t xml:space="preserve">Pustejovsky, J. E. </w:t>
-      </w:r>
-      <w:proofErr w:type="spellStart"/>
-      <w:r>
-        <w:t>clubSandwich</w:t>
-      </w:r>
-      <w:proofErr w:type="spellEnd"/>
-      <w:r>
-        <w:t>: Cluster-robust (sandwich) variance estimators with small-sample corrections. cran.r-project.org (2020).</w:t>
+        <w:t>Pustejovsky, J. E. clubSandwich: Cluster-robust (sandwich) variance estimators with small-sample corrections. cran.r-project.org (2020).</w:t>
       </w:r>
     </w:p>
     <w:p>
@@ -20199,15 +17807,7 @@
       </w:r>
       <w:r>
         <w:tab/>
-        <w:t xml:space="preserve">Joshi, M. &amp; Pustejovsky, J. E. </w:t>
-      </w:r>
-      <w:proofErr w:type="spellStart"/>
-      <w:r>
-        <w:t>wildmeta</w:t>
-      </w:r>
-      <w:proofErr w:type="spellEnd"/>
-      <w:r>
-        <w:t>: Cluster wild bootstrapping for meta-analysis. https://github.com/meghapsimatrix/wildmeta (2022).</w:t>
+        <w:t>Joshi, M. &amp; Pustejovsky, J. E. wildmeta: Cluster wild bootstrapping for meta-analysis. https://github.com/meghapsimatrix/wildmeta (2022).</w:t>
       </w:r>
     </w:p>
     <w:p>
@@ -20243,15 +17843,7 @@
       </w:r>
       <w:r>
         <w:tab/>
-        <w:t xml:space="preserve">Vembye, M. H. </w:t>
-      </w:r>
-      <w:proofErr w:type="spellStart"/>
-      <w:r>
-        <w:t>VIVECampbell</w:t>
-      </w:r>
-      <w:proofErr w:type="spellEnd"/>
-      <w:r>
-        <w:t>: Functions for Campbell reviews in VIVE. GitHub (2024).</w:t>
+        <w:t>Vembye, M. H. VIVECampbell: Functions for Campbell reviews in VIVE. GitHub (2024).</w:t>
       </w:r>
     </w:p>
     <w:p>
@@ -20276,33 +17868,8 @@
           <w:i/>
           <w:iCs/>
         </w:rPr>
-        <w:t xml:space="preserve">Bootstrap </w:t>
-      </w:r>
-      <w:proofErr w:type="spellStart"/>
-      <w:r>
-        <w:rPr>
-          <w:i/>
-          <w:iCs/>
-        </w:rPr>
-        <w:t>Funct</w:t>
-      </w:r>
-      <w:proofErr w:type="spellEnd"/>
-      <w:r>
-        <w:rPr>
-          <w:i/>
-          <w:iCs/>
-        </w:rPr>
-        <w:t xml:space="preserve">. CRAN R </w:t>
-      </w:r>
-      <w:proofErr w:type="spellStart"/>
-      <w:r>
-        <w:rPr>
-          <w:i/>
-          <w:iCs/>
-        </w:rPr>
-        <w:t>Proj</w:t>
-      </w:r>
-      <w:proofErr w:type="spellEnd"/>
+        <w:t>Bootstrap Funct. CRAN R Proj</w:t>
+      </w:r>
       <w:r>
         <w:t xml:space="preserve"> (2017).</w:t>
       </w:r>
@@ -20322,23 +17889,7 @@
       </w:r>
       <w:r>
         <w:tab/>
-        <w:t xml:space="preserve">Pustejovsky, J. E., Joshi, M. &amp; </w:t>
-      </w:r>
-      <w:proofErr w:type="spellStart"/>
-      <w:r>
-        <w:t>Citkowicz</w:t>
-      </w:r>
-      <w:proofErr w:type="spellEnd"/>
-      <w:r>
-        <w:t xml:space="preserve">, M. </w:t>
-      </w:r>
-      <w:proofErr w:type="spellStart"/>
-      <w:r>
-        <w:t>metaselection</w:t>
-      </w:r>
-      <w:proofErr w:type="spellEnd"/>
-      <w:r>
-        <w:t>: Meta-analytic selection models with cluster-robust and cluster-bootstrap standard errors for dependent effect size estimates. (2025).</w:t>
+        <w:t>Pustejovsky, J. E., Joshi, M. &amp; Citkowicz, M. metaselection: Meta-analytic selection models with cluster-robust and cluster-bootstrap standard errors for dependent effect size estimates. (2025).</w:t>
       </w:r>
     </w:p>
     <w:p>
@@ -20362,23 +17913,7 @@
       </w:r>
       <w:r>
         <w:tab/>
-        <w:t xml:space="preserve">van </w:t>
-      </w:r>
-      <w:proofErr w:type="spellStart"/>
-      <w:r>
-        <w:t>Aert</w:t>
-      </w:r>
-      <w:proofErr w:type="spellEnd"/>
-      <w:r>
-        <w:t xml:space="preserve">, R. C. M. </w:t>
-      </w:r>
-      <w:proofErr w:type="spellStart"/>
-      <w:r>
-        <w:t>puniform</w:t>
-      </w:r>
-      <w:proofErr w:type="spellEnd"/>
-      <w:r>
-        <w:t xml:space="preserve">: Meta-analysis methods correcting for publication bias (No. </w:t>
+        <w:t xml:space="preserve">van Aert, R. C. M. puniform: Meta-analysis methods correcting for publication bias (No. </w:t>
       </w:r>
       <w:r>
         <w:rPr>
@@ -20398,6 +17933,27 @@
           <w:szCs w:val="20"/>
         </w:rPr>
         <w:fldChar w:fldCharType="end"/>
+      </w:r>
+    </w:p>
+    <w:p>
+      <w:pPr>
+        <w:rPr>
+          <w:rFonts w:ascii="Arial" w:hAnsi="Arial" w:cs="Arial"/>
+          <w:b/>
+          <w:color w:val="000000"/>
+          <w:sz w:val="20"/>
+          <w:szCs w:val="20"/>
+        </w:rPr>
+      </w:pPr>
+      <w:r>
+        <w:rPr>
+          <w:rFonts w:ascii="Arial" w:hAnsi="Arial" w:cs="Arial"/>
+          <w:b/>
+          <w:color w:val="000000"/>
+          <w:sz w:val="20"/>
+          <w:szCs w:val="20"/>
+        </w:rPr>
+        <w:br w:type="page"/>
       </w:r>
     </w:p>
     <w:p>
@@ -20429,6 +17985,7 @@
           <w:sz w:val="20"/>
           <w:szCs w:val="20"/>
         </w:rPr>
+        <w:lastRenderedPageBreak/>
         <w:t>Figures and Tables</w:t>
       </w:r>
     </w:p>
@@ -21999,10 +19556,10 @@
           <w:szCs w:val="20"/>
         </w:rPr>
         <w:drawing>
-          <wp:inline distT="0" distB="0" distL="0" distR="0" wp14:anchorId="001A2D09" wp14:editId="073E5B7C">
-            <wp:extent cx="4828032" cy="3713871"/>
-            <wp:effectExtent l="0" t="0" r="0" b="1270"/>
-            <wp:docPr id="4" name="Picture 4" descr="A graph of a diagram&#10;&#10;AI-generated content may be incorrect."/>
+          <wp:inline distT="0" distB="0" distL="0" distR="0" wp14:anchorId="4D54FF13" wp14:editId="30E709EB">
+            <wp:extent cx="5486400" cy="4220210"/>
+            <wp:effectExtent l="0" t="0" r="0" b="8890"/>
+            <wp:docPr id="7" name="Picture 7"/>
             <wp:cNvGraphicFramePr>
               <a:graphicFrameLocks xmlns:a="http://schemas.openxmlformats.org/drawingml/2006/main" noChangeAspect="1"/>
             </wp:cNvGraphicFramePr>
@@ -22010,7 +19567,7 @@
               <a:graphicData uri="http://schemas.openxmlformats.org/drawingml/2006/picture">
                 <pic:pic xmlns:pic="http://schemas.openxmlformats.org/drawingml/2006/picture">
                   <pic:nvPicPr>
-                    <pic:cNvPr id="3" name="Picture 3" descr="A graph of a diagram&#10;&#10;AI-generated content may be incorrect."/>
+                    <pic:cNvPr id="7" name="Picture 7"/>
                     <pic:cNvPicPr/>
                   </pic:nvPicPr>
                   <pic:blipFill>
@@ -22028,7 +19585,7 @@
                   <pic:spPr>
                     <a:xfrm>
                       <a:off x="0" y="0"/>
-                      <a:ext cx="4831549" cy="3716576"/>
+                      <a:ext cx="5486400" cy="4220210"/>
                     </a:xfrm>
                     <a:prstGeom prst="rect">
                       <a:avLst/>
@@ -22115,7 +19672,23 @@
           <w:sz w:val="20"/>
           <w:szCs w:val="20"/>
         </w:rPr>
-        <w:t>, slopes at the effect size level were obtained from PECHE-ISCW-RVE</w:t>
+        <w:t xml:space="preserve">, slopes at the effect size level were obtained from </w:t>
+      </w:r>
+      <w:r>
+        <w:rPr>
+          <w:rFonts w:ascii="Arial" w:hAnsi="Arial" w:cs="Arial"/>
+          <w:sz w:val="20"/>
+          <w:szCs w:val="20"/>
+        </w:rPr>
+        <w:t xml:space="preserve">the </w:t>
+      </w:r>
+      <w:r>
+        <w:rPr>
+          <w:rFonts w:ascii="Arial" w:hAnsi="Arial" w:cs="Arial"/>
+          <w:sz w:val="20"/>
+          <w:szCs w:val="20"/>
+        </w:rPr>
+        <w:t>PECHE-RVE</w:t>
       </w:r>
       <w:r>
         <w:rPr>
@@ -22164,7 +19737,23 @@
           <w:sz w:val="20"/>
           <w:szCs w:val="20"/>
         </w:rPr>
-        <w:t xml:space="preserve"> tests. Effects in the green region have p-values above 0.1, effects in the dark gray area have p-values between </w:t>
+        <w:t xml:space="preserve"> </w:t>
+      </w:r>
+      <w:r>
+        <w:rPr>
+          <w:rFonts w:ascii="Arial" w:hAnsi="Arial" w:cs="Arial"/>
+          <w:sz w:val="20"/>
+          <w:szCs w:val="20"/>
+        </w:rPr>
+        <w:t>model</w:t>
+      </w:r>
+      <w:r>
+        <w:rPr>
+          <w:rFonts w:ascii="Arial" w:hAnsi="Arial" w:cs="Arial"/>
+          <w:sz w:val="20"/>
+          <w:szCs w:val="20"/>
+        </w:rPr>
+        <w:t xml:space="preserve">. Effects in the green region have p-values above 0.1, effects in the dark gray area have p-values between </w:t>
       </w:r>
       <w:r>
         <w:rPr>
@@ -32168,6 +29757,7 @@
   <w:style w:type="character" w:default="1" w:styleId="DefaultParagraphFont">
     <w:name w:val="Default Paragraph Font"/>
     <w:uiPriority w:val="1"/>
+    <w:semiHidden/>
     <w:unhideWhenUsed/>
   </w:style>
   <w:style w:type="table" w:default="1" w:styleId="TableNormal">

</xml_diff>

<commit_message>
Working on version back to Beth
</commit_message>
<xml_diff>
--- a/PNASTemplateforMainManuscript Group-based.docx
+++ b/PNASTemplateforMainManuscript Group-based.docx
@@ -11103,7 +11103,39 @@
           <w:sz w:val="20"/>
           <w:szCs w:val="20"/>
         </w:rPr>
-        <w:t xml:space="preserve"> for screening and study management. Microsoft Excel was used for extracting covariates and background data, and R (4.5.1 &amp; 4.5.2) and RStudio for effect-size calculation, meta-analysis, and visualization. Key R packages included </w:t>
+        <w:t xml:space="preserve"> for screening and study management. Microsoft Excel was used for extracting covariates and background data, and R (4.5.1</w:t>
+      </w:r>
+      <w:r>
+        <w:rPr>
+          <w:rFonts w:ascii="Arial" w:hAnsi="Arial" w:cs="Arial"/>
+          <w:sz w:val="20"/>
+          <w:szCs w:val="20"/>
+        </w:rPr>
+        <w:t xml:space="preserve">, </w:t>
+      </w:r>
+      <w:r>
+        <w:rPr>
+          <w:rFonts w:ascii="Arial" w:hAnsi="Arial" w:cs="Arial"/>
+          <w:sz w:val="20"/>
+          <w:szCs w:val="20"/>
+        </w:rPr>
+        <w:t>4.5.2</w:t>
+      </w:r>
+      <w:r>
+        <w:rPr>
+          <w:rFonts w:ascii="Arial" w:hAnsi="Arial" w:cs="Arial"/>
+          <w:sz w:val="20"/>
+          <w:szCs w:val="20"/>
+        </w:rPr>
+        <w:t>, and 4.6.0</w:t>
+      </w:r>
+      <w:r>
+        <w:rPr>
+          <w:rFonts w:ascii="Arial" w:hAnsi="Arial" w:cs="Arial"/>
+          <w:sz w:val="20"/>
+          <w:szCs w:val="20"/>
+        </w:rPr>
+        <w:t xml:space="preserve">) and RStudio for effect-size calculation, meta-analysis, and visualization. Key R packages included </w:t>
       </w:r>
       <w:r>
         <w:rPr>

</xml_diff>